<commit_message>
left off at PRI: Carbon intensity of GDP (kg CO2e per constant 2015 US$ of GDP)
</commit_message>
<xml_diff>
--- a/research_insights/PRI.docx
+++ b/research_insights/PRI.docx
@@ -264,10 +264,81 @@
       <w:pPr>
         <w:rPr>
           <w:rFonts w:ascii="Times New Roman" w:hAnsi="Times New Roman" w:cs="Times New Roman"/>
-          <w:i/>
-          <w:iCs/>
-        </w:rPr>
-      </w:pPr>
+        </w:rPr>
+      </w:pPr>
+      <w:r>
+        <w:rPr>
+          <w:rFonts w:ascii="Times New Roman" w:hAnsi="Times New Roman" w:cs="Times New Roman"/>
+        </w:rPr>
+        <w:t>META:</w:t>
+      </w:r>
+    </w:p>
+    <w:p>
+      <w:pPr>
+        <w:rPr>
+          <w:rFonts w:ascii="Times New Roman" w:hAnsi="Times New Roman" w:cs="Times New Roman"/>
+        </w:rPr>
+      </w:pPr>
+    </w:p>
+    <w:p>
+      <w:pPr>
+        <w:pStyle w:val="ListParagraph"/>
+        <w:numPr>
+          <w:ilvl w:val="0"/>
+          <w:numId w:val="4"/>
+        </w:numPr>
+        <w:rPr>
+          <w:rFonts w:ascii="Times New Roman" w:hAnsi="Times New Roman" w:cs="Times New Roman"/>
+        </w:rPr>
+      </w:pPr>
+      <w:r>
+        <w:rPr>
+          <w:rFonts w:ascii="Times New Roman" w:hAnsi="Times New Roman" w:cs="Times New Roman"/>
+        </w:rPr>
+        <w:t>Energy and emissions seem to be the worse losers after Maria. Methane/CO2 up</w:t>
+      </w:r>
+      <w:r>
+        <w:rPr>
+          <w:rFonts w:ascii="Times New Roman" w:hAnsi="Times New Roman" w:cs="Times New Roman"/>
+        </w:rPr>
+        <w:t xml:space="preserve"> permanently. </w:t>
+      </w:r>
+    </w:p>
+    <w:p>
+      <w:pPr>
+        <w:pStyle w:val="ListParagraph"/>
+        <w:numPr>
+          <w:ilvl w:val="0"/>
+          <w:numId w:val="4"/>
+        </w:numPr>
+        <w:rPr>
+          <w:rFonts w:ascii="Times New Roman" w:hAnsi="Times New Roman" w:cs="Times New Roman"/>
+        </w:rPr>
+      </w:pPr>
+      <w:r>
+        <w:rPr>
+          <w:rFonts w:ascii="Times New Roman" w:hAnsi="Times New Roman" w:cs="Times New Roman"/>
+        </w:rPr>
+        <w:t xml:space="preserve">Food and Livestock production down. </w:t>
+      </w:r>
+    </w:p>
+    <w:p>
+      <w:pPr>
+        <w:pStyle w:val="ListParagraph"/>
+        <w:numPr>
+          <w:ilvl w:val="0"/>
+          <w:numId w:val="4"/>
+        </w:numPr>
+        <w:rPr>
+          <w:rFonts w:ascii="Times New Roman" w:hAnsi="Times New Roman" w:cs="Times New Roman"/>
+        </w:rPr>
+      </w:pPr>
+      <w:r>
+        <w:rPr>
+          <w:rFonts w:ascii="Times New Roman" w:hAnsi="Times New Roman" w:cs="Times New Roman"/>
+        </w:rPr>
+        <w:t xml:space="preserve">Corruption is a fun metric. Dips into negative perceptions post-Maria. </w:t>
+      </w:r>
     </w:p>
     <w:p>
       <w:pPr>
@@ -1237,6 +1308,1132 @@
           <w:iCs/>
         </w:rPr>
       </w:pPr>
+      <w:r>
+        <w:rPr>
+          <w:rFonts w:ascii="Times New Roman" w:hAnsi="Times New Roman" w:cs="Times New Roman"/>
+          <w:i/>
+          <w:iCs/>
+          <w:noProof/>
+        </w:rPr>
+        <w:lastRenderedPageBreak/>
+        <w:drawing>
+          <wp:inline distT="0" distB="0" distL="0" distR="0" wp14:anchorId="6933293C" wp14:editId="4989A75B">
+            <wp:extent cx="5943600" cy="7237095"/>
+            <wp:effectExtent l="0" t="0" r="0" b="1905"/>
+            <wp:docPr id="522780003" name="Picture 1"/>
+            <wp:cNvGraphicFramePr>
+              <a:graphicFrameLocks xmlns:a="http://schemas.openxmlformats.org/drawingml/2006/main" noChangeAspect="1"/>
+            </wp:cNvGraphicFramePr>
+            <a:graphic xmlns:a="http://schemas.openxmlformats.org/drawingml/2006/main">
+              <a:graphicData uri="http://schemas.openxmlformats.org/drawingml/2006/picture">
+                <pic:pic xmlns:pic="http://schemas.openxmlformats.org/drawingml/2006/picture">
+                  <pic:nvPicPr>
+                    <pic:cNvPr id="522780003" name="Picture 522780003"/>
+                    <pic:cNvPicPr/>
+                  </pic:nvPicPr>
+                  <pic:blipFill>
+                    <a:blip r:embed="rId14">
+                      <a:extLst>
+                        <a:ext uri="{28A0092B-C50C-407E-A947-70E740481C1C}">
+                          <a14:useLocalDpi xmlns:a14="http://schemas.microsoft.com/office/drawing/2010/main" val="0"/>
+                        </a:ext>
+                      </a:extLst>
+                    </a:blip>
+                    <a:stretch>
+                      <a:fillRect/>
+                    </a:stretch>
+                  </pic:blipFill>
+                  <pic:spPr>
+                    <a:xfrm>
+                      <a:off x="0" y="0"/>
+                      <a:ext cx="5943600" cy="7237095"/>
+                    </a:xfrm>
+                    <a:prstGeom prst="rect">
+                      <a:avLst/>
+                    </a:prstGeom>
+                  </pic:spPr>
+                </pic:pic>
+              </a:graphicData>
+            </a:graphic>
+          </wp:inline>
+        </w:drawing>
+      </w:r>
+    </w:p>
+    <w:p>
+      <w:pPr>
+        <w:rPr>
+          <w:rFonts w:ascii="Times New Roman" w:hAnsi="Times New Roman" w:cs="Times New Roman"/>
+        </w:rPr>
+      </w:pPr>
+      <w:r>
+        <w:rPr>
+          <w:rFonts w:ascii="Times New Roman" w:hAnsi="Times New Roman" w:cs="Times New Roman"/>
+        </w:rPr>
+        <w:t xml:space="preserve">ALEXANDER: Now here’s some juice. Greenhouse emissions went up after Maria and they haven’t really come back down to pre-Maria levels. People were using gas-powered plants to light their homes since many places were out of power for months. </w:t>
+      </w:r>
+    </w:p>
+    <w:p>
+      <w:pPr>
+        <w:rPr>
+          <w:rFonts w:ascii="Times New Roman" w:hAnsi="Times New Roman" w:cs="Times New Roman"/>
+        </w:rPr>
+      </w:pPr>
+    </w:p>
+    <w:p>
+      <w:pPr>
+        <w:rPr>
+          <w:rFonts w:ascii="Times New Roman" w:hAnsi="Times New Roman" w:cs="Times New Roman"/>
+        </w:rPr>
+      </w:pPr>
+    </w:p>
+    <w:p>
+      <w:pPr>
+        <w:rPr>
+          <w:rFonts w:ascii="Times New Roman" w:hAnsi="Times New Roman" w:cs="Times New Roman"/>
+        </w:rPr>
+      </w:pPr>
+      <w:r>
+        <w:rPr>
+          <w:rFonts w:ascii="Times New Roman" w:hAnsi="Times New Roman" w:cs="Times New Roman"/>
+          <w:noProof/>
+        </w:rPr>
+        <w:lastRenderedPageBreak/>
+        <w:drawing>
+          <wp:inline distT="0" distB="0" distL="0" distR="0" wp14:anchorId="2DF1EB39" wp14:editId="65DEEE57">
+            <wp:extent cx="5943600" cy="3594100"/>
+            <wp:effectExtent l="0" t="0" r="0" b="0"/>
+            <wp:docPr id="549434223" name="Picture 2" descr="A graph with a line and a line&#10;&#10;Description automatically generated"/>
+            <wp:cNvGraphicFramePr>
+              <a:graphicFrameLocks xmlns:a="http://schemas.openxmlformats.org/drawingml/2006/main" noChangeAspect="1"/>
+            </wp:cNvGraphicFramePr>
+            <a:graphic xmlns:a="http://schemas.openxmlformats.org/drawingml/2006/main">
+              <a:graphicData uri="http://schemas.openxmlformats.org/drawingml/2006/picture">
+                <pic:pic xmlns:pic="http://schemas.openxmlformats.org/drawingml/2006/picture">
+                  <pic:nvPicPr>
+                    <pic:cNvPr id="549434223" name="Picture 2" descr="A graph with a line and a line&#10;&#10;Description automatically generated"/>
+                    <pic:cNvPicPr/>
+                  </pic:nvPicPr>
+                  <pic:blipFill>
+                    <a:blip r:embed="rId15">
+                      <a:extLst>
+                        <a:ext uri="{28A0092B-C50C-407E-A947-70E740481C1C}">
+                          <a14:useLocalDpi xmlns:a14="http://schemas.microsoft.com/office/drawing/2010/main" val="0"/>
+                        </a:ext>
+                      </a:extLst>
+                    </a:blip>
+                    <a:stretch>
+                      <a:fillRect/>
+                    </a:stretch>
+                  </pic:blipFill>
+                  <pic:spPr>
+                    <a:xfrm>
+                      <a:off x="0" y="0"/>
+                      <a:ext cx="5943600" cy="3594100"/>
+                    </a:xfrm>
+                    <a:prstGeom prst="rect">
+                      <a:avLst/>
+                    </a:prstGeom>
+                  </pic:spPr>
+                </pic:pic>
+              </a:graphicData>
+            </a:graphic>
+          </wp:inline>
+        </w:drawing>
+      </w:r>
+    </w:p>
+    <w:p>
+      <w:pPr>
+        <w:rPr>
+          <w:rFonts w:ascii="Times New Roman" w:hAnsi="Times New Roman" w:cs="Times New Roman"/>
+        </w:rPr>
+      </w:pPr>
+    </w:p>
+    <w:p>
+      <w:pPr>
+        <w:rPr>
+          <w:rFonts w:ascii="Times New Roman" w:hAnsi="Times New Roman" w:cs="Times New Roman"/>
+        </w:rPr>
+      </w:pPr>
+      <w:r>
+        <w:rPr>
+          <w:rFonts w:ascii="Times New Roman" w:hAnsi="Times New Roman" w:cs="Times New Roman"/>
+        </w:rPr>
+        <w:t xml:space="preserve">ALEXANDER: Maybe there’s some correlation with renewable energy consumption? It did go down after Maria, but then normalizes into the upwards trend it’s been on for a while. Green house emissions don’t follow an inverse correlation, yet they still go up. </w:t>
+      </w:r>
+    </w:p>
+    <w:p>
+      <w:pPr>
+        <w:rPr>
+          <w:rFonts w:ascii="Times New Roman" w:hAnsi="Times New Roman" w:cs="Times New Roman"/>
+        </w:rPr>
+      </w:pPr>
+    </w:p>
+    <w:p>
+      <w:pPr>
+        <w:rPr>
+          <w:rFonts w:ascii="Times New Roman" w:hAnsi="Times New Roman" w:cs="Times New Roman"/>
+        </w:rPr>
+      </w:pPr>
+    </w:p>
+    <w:p>
+      <w:pPr>
+        <w:rPr>
+          <w:rFonts w:ascii="Times New Roman" w:hAnsi="Times New Roman" w:cs="Times New Roman"/>
+        </w:rPr>
+      </w:pPr>
+    </w:p>
+    <w:p>
+      <w:pPr>
+        <w:rPr>
+          <w:rFonts w:ascii="Times New Roman" w:hAnsi="Times New Roman" w:cs="Times New Roman"/>
+        </w:rPr>
+      </w:pPr>
+    </w:p>
+    <w:p>
+      <w:pPr>
+        <w:rPr>
+          <w:rFonts w:ascii="Times New Roman" w:hAnsi="Times New Roman" w:cs="Times New Roman"/>
+        </w:rPr>
+      </w:pPr>
+      <w:r>
+        <w:rPr>
+          <w:rFonts w:ascii="Times New Roman" w:hAnsi="Times New Roman" w:cs="Times New Roman"/>
+          <w:noProof/>
+        </w:rPr>
+        <w:lastRenderedPageBreak/>
+        <w:drawing>
+          <wp:inline distT="0" distB="0" distL="0" distR="0" wp14:anchorId="163A1932" wp14:editId="7D031E9B">
+            <wp:extent cx="5943600" cy="3558540"/>
+            <wp:effectExtent l="0" t="0" r="0" b="0"/>
+            <wp:docPr id="163018465" name="Picture 3"/>
+            <wp:cNvGraphicFramePr>
+              <a:graphicFrameLocks xmlns:a="http://schemas.openxmlformats.org/drawingml/2006/main" noChangeAspect="1"/>
+            </wp:cNvGraphicFramePr>
+            <a:graphic xmlns:a="http://schemas.openxmlformats.org/drawingml/2006/main">
+              <a:graphicData uri="http://schemas.openxmlformats.org/drawingml/2006/picture">
+                <pic:pic xmlns:pic="http://schemas.openxmlformats.org/drawingml/2006/picture">
+                  <pic:nvPicPr>
+                    <pic:cNvPr id="163018465" name="Picture 163018465"/>
+                    <pic:cNvPicPr/>
+                  </pic:nvPicPr>
+                  <pic:blipFill>
+                    <a:blip r:embed="rId16">
+                      <a:extLst>
+                        <a:ext uri="{28A0092B-C50C-407E-A947-70E740481C1C}">
+                          <a14:useLocalDpi xmlns:a14="http://schemas.microsoft.com/office/drawing/2010/main" val="0"/>
+                        </a:ext>
+                      </a:extLst>
+                    </a:blip>
+                    <a:stretch>
+                      <a:fillRect/>
+                    </a:stretch>
+                  </pic:blipFill>
+                  <pic:spPr>
+                    <a:xfrm>
+                      <a:off x="0" y="0"/>
+                      <a:ext cx="5943600" cy="3558540"/>
+                    </a:xfrm>
+                    <a:prstGeom prst="rect">
+                      <a:avLst/>
+                    </a:prstGeom>
+                  </pic:spPr>
+                </pic:pic>
+              </a:graphicData>
+            </a:graphic>
+          </wp:inline>
+        </w:drawing>
+      </w:r>
+    </w:p>
+    <w:p>
+      <w:pPr>
+        <w:rPr>
+          <w:rFonts w:ascii="Times New Roman" w:hAnsi="Times New Roman" w:cs="Times New Roman"/>
+        </w:rPr>
+      </w:pPr>
+      <w:r>
+        <w:rPr>
+          <w:rFonts w:ascii="Times New Roman" w:hAnsi="Times New Roman" w:cs="Times New Roman"/>
+          <w:noProof/>
+        </w:rPr>
+        <w:drawing>
+          <wp:inline distT="0" distB="0" distL="0" distR="0" wp14:anchorId="6677B1CB" wp14:editId="74D953F4">
+            <wp:extent cx="5943600" cy="3580765"/>
+            <wp:effectExtent l="0" t="0" r="0" b="635"/>
+            <wp:docPr id="1085919630" name="Picture 4"/>
+            <wp:cNvGraphicFramePr>
+              <a:graphicFrameLocks xmlns:a="http://schemas.openxmlformats.org/drawingml/2006/main" noChangeAspect="1"/>
+            </wp:cNvGraphicFramePr>
+            <a:graphic xmlns:a="http://schemas.openxmlformats.org/drawingml/2006/main">
+              <a:graphicData uri="http://schemas.openxmlformats.org/drawingml/2006/picture">
+                <pic:pic xmlns:pic="http://schemas.openxmlformats.org/drawingml/2006/picture">
+                  <pic:nvPicPr>
+                    <pic:cNvPr id="1085919630" name="Picture 1085919630"/>
+                    <pic:cNvPicPr/>
+                  </pic:nvPicPr>
+                  <pic:blipFill>
+                    <a:blip r:embed="rId17" cstate="print">
+                      <a:extLst>
+                        <a:ext uri="{28A0092B-C50C-407E-A947-70E740481C1C}">
+                          <a14:useLocalDpi xmlns:a14="http://schemas.microsoft.com/office/drawing/2010/main" val="0"/>
+                        </a:ext>
+                      </a:extLst>
+                    </a:blip>
+                    <a:stretch>
+                      <a:fillRect/>
+                    </a:stretch>
+                  </pic:blipFill>
+                  <pic:spPr>
+                    <a:xfrm>
+                      <a:off x="0" y="0"/>
+                      <a:ext cx="5943600" cy="3580765"/>
+                    </a:xfrm>
+                    <a:prstGeom prst="rect">
+                      <a:avLst/>
+                    </a:prstGeom>
+                  </pic:spPr>
+                </pic:pic>
+              </a:graphicData>
+            </a:graphic>
+          </wp:inline>
+        </w:drawing>
+      </w:r>
+    </w:p>
+    <w:p>
+      <w:pPr>
+        <w:rPr>
+          <w:rFonts w:ascii="Times New Roman" w:hAnsi="Times New Roman" w:cs="Times New Roman"/>
+        </w:rPr>
+      </w:pPr>
+    </w:p>
+    <w:p>
+      <w:pPr>
+        <w:rPr>
+          <w:rFonts w:ascii="Times New Roman" w:hAnsi="Times New Roman" w:cs="Times New Roman"/>
+        </w:rPr>
+      </w:pPr>
+      <w:r>
+        <w:rPr>
+          <w:rFonts w:ascii="Times New Roman" w:hAnsi="Times New Roman" w:cs="Times New Roman"/>
+        </w:rPr>
+        <w:t xml:space="preserve">ALEXANDER: Methane emissions have struggled to go back to pre-Maria levels. There was a sharp downwards trend between 2014 and 2016, and then a spike post-Maria, and now a very, very slow descent back down to 2016 levels. </w:t>
+      </w:r>
+    </w:p>
+    <w:p>
+      <w:pPr>
+        <w:rPr>
+          <w:rFonts w:ascii="Times New Roman" w:hAnsi="Times New Roman" w:cs="Times New Roman"/>
+        </w:rPr>
+      </w:pPr>
+    </w:p>
+    <w:p>
+      <w:pPr>
+        <w:rPr>
+          <w:rFonts w:ascii="Times New Roman" w:hAnsi="Times New Roman" w:cs="Times New Roman"/>
+        </w:rPr>
+      </w:pPr>
+    </w:p>
+    <w:p>
+      <w:pPr>
+        <w:rPr>
+          <w:rFonts w:ascii="Times New Roman" w:hAnsi="Times New Roman" w:cs="Times New Roman"/>
+        </w:rPr>
+      </w:pPr>
+      <w:r>
+        <w:rPr>
+          <w:rFonts w:ascii="Times New Roman" w:hAnsi="Times New Roman" w:cs="Times New Roman"/>
+          <w:noProof/>
+        </w:rPr>
+        <w:lastRenderedPageBreak/>
+        <w:drawing>
+          <wp:inline distT="0" distB="0" distL="0" distR="0" wp14:anchorId="46B1BB50" wp14:editId="758522F4">
+            <wp:extent cx="5943600" cy="7148830"/>
+            <wp:effectExtent l="0" t="0" r="0" b="1270"/>
+            <wp:docPr id="1223461113" name="Picture 6"/>
+            <wp:cNvGraphicFramePr>
+              <a:graphicFrameLocks xmlns:a="http://schemas.openxmlformats.org/drawingml/2006/main" noChangeAspect="1"/>
+            </wp:cNvGraphicFramePr>
+            <a:graphic xmlns:a="http://schemas.openxmlformats.org/drawingml/2006/main">
+              <a:graphicData uri="http://schemas.openxmlformats.org/drawingml/2006/picture">
+                <pic:pic xmlns:pic="http://schemas.openxmlformats.org/drawingml/2006/picture">
+                  <pic:nvPicPr>
+                    <pic:cNvPr id="1223461113" name="Picture 1223461113"/>
+                    <pic:cNvPicPr/>
+                  </pic:nvPicPr>
+                  <pic:blipFill>
+                    <a:blip r:embed="rId18">
+                      <a:extLst>
+                        <a:ext uri="{28A0092B-C50C-407E-A947-70E740481C1C}">
+                          <a14:useLocalDpi xmlns:a14="http://schemas.microsoft.com/office/drawing/2010/main" val="0"/>
+                        </a:ext>
+                      </a:extLst>
+                    </a:blip>
+                    <a:stretch>
+                      <a:fillRect/>
+                    </a:stretch>
+                  </pic:blipFill>
+                  <pic:spPr>
+                    <a:xfrm>
+                      <a:off x="0" y="0"/>
+                      <a:ext cx="5943600" cy="7148830"/>
+                    </a:xfrm>
+                    <a:prstGeom prst="rect">
+                      <a:avLst/>
+                    </a:prstGeom>
+                  </pic:spPr>
+                </pic:pic>
+              </a:graphicData>
+            </a:graphic>
+          </wp:inline>
+        </w:drawing>
+      </w:r>
+    </w:p>
+    <w:p>
+      <w:pPr>
+        <w:rPr>
+          <w:rFonts w:ascii="Times New Roman" w:hAnsi="Times New Roman" w:cs="Times New Roman"/>
+        </w:rPr>
+      </w:pPr>
+      <w:r>
+        <w:rPr>
+          <w:rFonts w:ascii="Times New Roman" w:hAnsi="Times New Roman" w:cs="Times New Roman"/>
+        </w:rPr>
+        <w:t xml:space="preserve">ALEXANDER: Suggests methane emissions from reconstruction. Things haven’t been the same since Maria. There was some pre-Maria normalization because of COVID, but things went back to post-Maria normal afterwards. </w:t>
+      </w:r>
+    </w:p>
+    <w:p>
+      <w:pPr>
+        <w:rPr>
+          <w:rFonts w:ascii="Times New Roman" w:hAnsi="Times New Roman" w:cs="Times New Roman"/>
+        </w:rPr>
+      </w:pPr>
+    </w:p>
+    <w:p>
+      <w:pPr>
+        <w:rPr>
+          <w:rFonts w:ascii="Times New Roman" w:hAnsi="Times New Roman" w:cs="Times New Roman"/>
+        </w:rPr>
+      </w:pPr>
+      <w:r>
+        <w:rPr>
+          <w:rFonts w:ascii="Times New Roman" w:hAnsi="Times New Roman" w:cs="Times New Roman"/>
+          <w:noProof/>
+        </w:rPr>
+        <w:lastRenderedPageBreak/>
+        <w:drawing>
+          <wp:inline distT="0" distB="0" distL="0" distR="0" wp14:anchorId="4003C69B" wp14:editId="2E2C7C9B">
+            <wp:extent cx="5943600" cy="7198995"/>
+            <wp:effectExtent l="0" t="0" r="0" b="1905"/>
+            <wp:docPr id="2108217422" name="Picture 5" descr="A graph of a graph with blue lines&#10;&#10;Description automatically generated"/>
+            <wp:cNvGraphicFramePr>
+              <a:graphicFrameLocks xmlns:a="http://schemas.openxmlformats.org/drawingml/2006/main" noChangeAspect="1"/>
+            </wp:cNvGraphicFramePr>
+            <a:graphic xmlns:a="http://schemas.openxmlformats.org/drawingml/2006/main">
+              <a:graphicData uri="http://schemas.openxmlformats.org/drawingml/2006/picture">
+                <pic:pic xmlns:pic="http://schemas.openxmlformats.org/drawingml/2006/picture">
+                  <pic:nvPicPr>
+                    <pic:cNvPr id="2108217422" name="Picture 5" descr="A graph of a graph with blue lines&#10;&#10;Description automatically generated"/>
+                    <pic:cNvPicPr/>
+                  </pic:nvPicPr>
+                  <pic:blipFill>
+                    <a:blip r:embed="rId19">
+                      <a:extLst>
+                        <a:ext uri="{28A0092B-C50C-407E-A947-70E740481C1C}">
+                          <a14:useLocalDpi xmlns:a14="http://schemas.microsoft.com/office/drawing/2010/main" val="0"/>
+                        </a:ext>
+                      </a:extLst>
+                    </a:blip>
+                    <a:stretch>
+                      <a:fillRect/>
+                    </a:stretch>
+                  </pic:blipFill>
+                  <pic:spPr>
+                    <a:xfrm>
+                      <a:off x="0" y="0"/>
+                      <a:ext cx="5943600" cy="7198995"/>
+                    </a:xfrm>
+                    <a:prstGeom prst="rect">
+                      <a:avLst/>
+                    </a:prstGeom>
+                  </pic:spPr>
+                </pic:pic>
+              </a:graphicData>
+            </a:graphic>
+          </wp:inline>
+        </w:drawing>
+      </w:r>
+    </w:p>
+    <w:p>
+      <w:pPr>
+        <w:rPr>
+          <w:rFonts w:ascii="Times New Roman" w:hAnsi="Times New Roman" w:cs="Times New Roman"/>
+        </w:rPr>
+      </w:pPr>
+    </w:p>
+    <w:p>
+      <w:pPr>
+        <w:rPr>
+          <w:rFonts w:ascii="Times New Roman" w:hAnsi="Times New Roman" w:cs="Times New Roman"/>
+        </w:rPr>
+      </w:pPr>
+      <w:r>
+        <w:rPr>
+          <w:rFonts w:ascii="Times New Roman" w:hAnsi="Times New Roman" w:cs="Times New Roman"/>
+        </w:rPr>
+        <w:t xml:space="preserve">ALEXANDER: </w:t>
+      </w:r>
+      <w:r>
+        <w:rPr>
+          <w:rFonts w:ascii="Times New Roman" w:hAnsi="Times New Roman" w:cs="Times New Roman"/>
+        </w:rPr>
+        <w:t xml:space="preserve">Zoom-In. </w:t>
+      </w:r>
+    </w:p>
+    <w:p>
+      <w:pPr>
+        <w:rPr>
+          <w:rFonts w:ascii="Times New Roman" w:hAnsi="Times New Roman" w:cs="Times New Roman"/>
+        </w:rPr>
+      </w:pPr>
+    </w:p>
+    <w:p>
+      <w:pPr>
+        <w:rPr>
+          <w:rFonts w:ascii="Times New Roman" w:hAnsi="Times New Roman" w:cs="Times New Roman"/>
+        </w:rPr>
+      </w:pPr>
+    </w:p>
+    <w:p>
+      <w:pPr>
+        <w:rPr>
+          <w:rFonts w:ascii="Times New Roman" w:hAnsi="Times New Roman" w:cs="Times New Roman"/>
+        </w:rPr>
+      </w:pPr>
+    </w:p>
+    <w:p>
+      <w:pPr>
+        <w:rPr>
+          <w:rFonts w:ascii="Times New Roman" w:hAnsi="Times New Roman" w:cs="Times New Roman"/>
+        </w:rPr>
+      </w:pPr>
+      <w:r>
+        <w:rPr>
+          <w:rFonts w:ascii="Times New Roman" w:hAnsi="Times New Roman" w:cs="Times New Roman"/>
+          <w:noProof/>
+        </w:rPr>
+        <w:lastRenderedPageBreak/>
+        <w:drawing>
+          <wp:inline distT="0" distB="0" distL="0" distR="0" wp14:anchorId="1EE5AB66" wp14:editId="488D6FB2">
+            <wp:extent cx="5943600" cy="3620770"/>
+            <wp:effectExtent l="0" t="0" r="0" b="0"/>
+            <wp:docPr id="2120236511" name="Picture 7"/>
+            <wp:cNvGraphicFramePr>
+              <a:graphicFrameLocks xmlns:a="http://schemas.openxmlformats.org/drawingml/2006/main" noChangeAspect="1"/>
+            </wp:cNvGraphicFramePr>
+            <a:graphic xmlns:a="http://schemas.openxmlformats.org/drawingml/2006/main">
+              <a:graphicData uri="http://schemas.openxmlformats.org/drawingml/2006/picture">
+                <pic:pic xmlns:pic="http://schemas.openxmlformats.org/drawingml/2006/picture">
+                  <pic:nvPicPr>
+                    <pic:cNvPr id="2120236511" name="Picture 2120236511"/>
+                    <pic:cNvPicPr/>
+                  </pic:nvPicPr>
+                  <pic:blipFill>
+                    <a:blip r:embed="rId20">
+                      <a:extLst>
+                        <a:ext uri="{28A0092B-C50C-407E-A947-70E740481C1C}">
+                          <a14:useLocalDpi xmlns:a14="http://schemas.microsoft.com/office/drawing/2010/main" val="0"/>
+                        </a:ext>
+                      </a:extLst>
+                    </a:blip>
+                    <a:stretch>
+                      <a:fillRect/>
+                    </a:stretch>
+                  </pic:blipFill>
+                  <pic:spPr>
+                    <a:xfrm>
+                      <a:off x="0" y="0"/>
+                      <a:ext cx="5943600" cy="3620770"/>
+                    </a:xfrm>
+                    <a:prstGeom prst="rect">
+                      <a:avLst/>
+                    </a:prstGeom>
+                  </pic:spPr>
+                </pic:pic>
+              </a:graphicData>
+            </a:graphic>
+          </wp:inline>
+        </w:drawing>
+      </w:r>
+    </w:p>
+    <w:p>
+      <w:pPr>
+        <w:rPr>
+          <w:rFonts w:ascii="Times New Roman" w:hAnsi="Times New Roman" w:cs="Times New Roman"/>
+        </w:rPr>
+      </w:pPr>
+    </w:p>
+    <w:p>
+      <w:pPr>
+        <w:rPr>
+          <w:rFonts w:ascii="Times New Roman" w:hAnsi="Times New Roman" w:cs="Times New Roman"/>
+        </w:rPr>
+      </w:pPr>
+      <w:r>
+        <w:rPr>
+          <w:rFonts w:ascii="Times New Roman" w:hAnsi="Times New Roman" w:cs="Times New Roman"/>
+        </w:rPr>
+        <w:t xml:space="preserve">ALEXANDER: Did Maria kill some big industry? </w:t>
+      </w:r>
+    </w:p>
+    <w:p>
+      <w:pPr>
+        <w:rPr>
+          <w:rFonts w:ascii="Times New Roman" w:hAnsi="Times New Roman" w:cs="Times New Roman"/>
+        </w:rPr>
+      </w:pPr>
+    </w:p>
+    <w:p>
+      <w:pPr>
+        <w:rPr>
+          <w:rFonts w:ascii="Times New Roman" w:hAnsi="Times New Roman" w:cs="Times New Roman"/>
+        </w:rPr>
+      </w:pPr>
+    </w:p>
+    <w:p>
+      <w:pPr>
+        <w:rPr>
+          <w:rFonts w:ascii="Times New Roman" w:hAnsi="Times New Roman" w:cs="Times New Roman"/>
+        </w:rPr>
+      </w:pPr>
+    </w:p>
+    <w:p>
+      <w:pPr>
+        <w:rPr>
+          <w:rFonts w:ascii="Times New Roman" w:hAnsi="Times New Roman" w:cs="Times New Roman"/>
+        </w:rPr>
+      </w:pPr>
+    </w:p>
+    <w:p>
+      <w:pPr>
+        <w:rPr>
+          <w:rFonts w:ascii="Times New Roman" w:hAnsi="Times New Roman" w:cs="Times New Roman"/>
+        </w:rPr>
+      </w:pPr>
+      <w:r>
+        <w:rPr>
+          <w:rFonts w:ascii="Times New Roman" w:hAnsi="Times New Roman" w:cs="Times New Roman"/>
+          <w:noProof/>
+        </w:rPr>
+        <w:lastRenderedPageBreak/>
+        <w:drawing>
+          <wp:inline distT="0" distB="0" distL="0" distR="0" wp14:anchorId="1772FD5E" wp14:editId="69766E41">
+            <wp:extent cx="5943600" cy="3575685"/>
+            <wp:effectExtent l="0" t="0" r="0" b="5715"/>
+            <wp:docPr id="759342307" name="Picture 8"/>
+            <wp:cNvGraphicFramePr>
+              <a:graphicFrameLocks xmlns:a="http://schemas.openxmlformats.org/drawingml/2006/main" noChangeAspect="1"/>
+            </wp:cNvGraphicFramePr>
+            <a:graphic xmlns:a="http://schemas.openxmlformats.org/drawingml/2006/main">
+              <a:graphicData uri="http://schemas.openxmlformats.org/drawingml/2006/picture">
+                <pic:pic xmlns:pic="http://schemas.openxmlformats.org/drawingml/2006/picture">
+                  <pic:nvPicPr>
+                    <pic:cNvPr id="759342307" name="Picture 759342307"/>
+                    <pic:cNvPicPr/>
+                  </pic:nvPicPr>
+                  <pic:blipFill>
+                    <a:blip r:embed="rId21">
+                      <a:extLst>
+                        <a:ext uri="{28A0092B-C50C-407E-A947-70E740481C1C}">
+                          <a14:useLocalDpi xmlns:a14="http://schemas.microsoft.com/office/drawing/2010/main" val="0"/>
+                        </a:ext>
+                      </a:extLst>
+                    </a:blip>
+                    <a:stretch>
+                      <a:fillRect/>
+                    </a:stretch>
+                  </pic:blipFill>
+                  <pic:spPr>
+                    <a:xfrm>
+                      <a:off x="0" y="0"/>
+                      <a:ext cx="5943600" cy="3575685"/>
+                    </a:xfrm>
+                    <a:prstGeom prst="rect">
+                      <a:avLst/>
+                    </a:prstGeom>
+                  </pic:spPr>
+                </pic:pic>
+              </a:graphicData>
+            </a:graphic>
+          </wp:inline>
+        </w:drawing>
+      </w:r>
+    </w:p>
+    <w:p>
+      <w:pPr>
+        <w:rPr>
+          <w:rFonts w:ascii="Times New Roman" w:hAnsi="Times New Roman" w:cs="Times New Roman"/>
+        </w:rPr>
+      </w:pPr>
+    </w:p>
+    <w:p>
+      <w:pPr>
+        <w:rPr>
+          <w:rFonts w:ascii="Times New Roman" w:hAnsi="Times New Roman" w:cs="Times New Roman"/>
+        </w:rPr>
+      </w:pPr>
+    </w:p>
+    <w:p>
+      <w:pPr>
+        <w:rPr>
+          <w:rFonts w:ascii="Times New Roman" w:hAnsi="Times New Roman" w:cs="Times New Roman"/>
+          <w:color w:val="FF0000"/>
+        </w:rPr>
+      </w:pPr>
+      <w:r>
+        <w:rPr>
+          <w:rFonts w:ascii="Times New Roman" w:hAnsi="Times New Roman" w:cs="Times New Roman"/>
+        </w:rPr>
+        <w:t>ALEXANDER: Still a sharp downwards trend in total Methane emissions</w:t>
+      </w:r>
+      <w:r>
+        <w:rPr>
+          <w:rFonts w:ascii="Times New Roman" w:hAnsi="Times New Roman" w:cs="Times New Roman"/>
+          <w:color w:val="FF0000"/>
+        </w:rPr>
+        <w:t xml:space="preserve">. I should look into the proportions of methane emissions. </w:t>
+      </w:r>
+    </w:p>
+    <w:p>
+      <w:pPr>
+        <w:rPr>
+          <w:rFonts w:ascii="Times New Roman" w:hAnsi="Times New Roman" w:cs="Times New Roman"/>
+          <w:color w:val="FF0000"/>
+        </w:rPr>
+      </w:pPr>
+    </w:p>
+    <w:p>
+      <w:pPr>
+        <w:rPr>
+          <w:rFonts w:ascii="Times New Roman" w:hAnsi="Times New Roman" w:cs="Times New Roman"/>
+          <w:color w:val="FF0000"/>
+        </w:rPr>
+      </w:pPr>
+    </w:p>
+    <w:p>
+      <w:pPr>
+        <w:rPr>
+          <w:rFonts w:ascii="Times New Roman" w:hAnsi="Times New Roman" w:cs="Times New Roman"/>
+          <w:color w:val="FF0000"/>
+        </w:rPr>
+      </w:pPr>
+    </w:p>
+    <w:p>
+      <w:pPr>
+        <w:rPr>
+          <w:rFonts w:ascii="Times New Roman" w:hAnsi="Times New Roman" w:cs="Times New Roman"/>
+        </w:rPr>
+      </w:pPr>
+      <w:r>
+        <w:rPr>
+          <w:rFonts w:ascii="Times New Roman" w:hAnsi="Times New Roman" w:cs="Times New Roman"/>
+          <w:noProof/>
+        </w:rPr>
+        <w:lastRenderedPageBreak/>
+        <w:drawing>
+          <wp:inline distT="0" distB="0" distL="0" distR="0" wp14:anchorId="332B2002" wp14:editId="2F3EFB08">
+            <wp:extent cx="5943600" cy="3564255"/>
+            <wp:effectExtent l="0" t="0" r="0" b="4445"/>
+            <wp:docPr id="388261466" name="Picture 9"/>
+            <wp:cNvGraphicFramePr>
+              <a:graphicFrameLocks xmlns:a="http://schemas.openxmlformats.org/drawingml/2006/main" noChangeAspect="1"/>
+            </wp:cNvGraphicFramePr>
+            <a:graphic xmlns:a="http://schemas.openxmlformats.org/drawingml/2006/main">
+              <a:graphicData uri="http://schemas.openxmlformats.org/drawingml/2006/picture">
+                <pic:pic xmlns:pic="http://schemas.openxmlformats.org/drawingml/2006/picture">
+                  <pic:nvPicPr>
+                    <pic:cNvPr id="388261466" name="Picture 388261466"/>
+                    <pic:cNvPicPr/>
+                  </pic:nvPicPr>
+                  <pic:blipFill>
+                    <a:blip r:embed="rId22">
+                      <a:extLst>
+                        <a:ext uri="{28A0092B-C50C-407E-A947-70E740481C1C}">
+                          <a14:useLocalDpi xmlns:a14="http://schemas.microsoft.com/office/drawing/2010/main" val="0"/>
+                        </a:ext>
+                      </a:extLst>
+                    </a:blip>
+                    <a:stretch>
+                      <a:fillRect/>
+                    </a:stretch>
+                  </pic:blipFill>
+                  <pic:spPr>
+                    <a:xfrm>
+                      <a:off x="0" y="0"/>
+                      <a:ext cx="5943600" cy="3564255"/>
+                    </a:xfrm>
+                    <a:prstGeom prst="rect">
+                      <a:avLst/>
+                    </a:prstGeom>
+                  </pic:spPr>
+                </pic:pic>
+              </a:graphicData>
+            </a:graphic>
+          </wp:inline>
+        </w:drawing>
+      </w:r>
+    </w:p>
+    <w:p>
+      <w:pPr>
+        <w:rPr>
+          <w:rFonts w:ascii="Times New Roman" w:hAnsi="Times New Roman" w:cs="Times New Roman"/>
+        </w:rPr>
+      </w:pPr>
+    </w:p>
+    <w:p>
+      <w:pPr>
+        <w:rPr>
+          <w:rFonts w:ascii="Times New Roman" w:hAnsi="Times New Roman" w:cs="Times New Roman"/>
+        </w:rPr>
+      </w:pPr>
+      <w:r>
+        <w:rPr>
+          <w:rFonts w:ascii="Times New Roman" w:hAnsi="Times New Roman" w:cs="Times New Roman"/>
+        </w:rPr>
+        <w:t xml:space="preserve">ALEXANDER: Maria made the power grid less green. </w:t>
+      </w:r>
+    </w:p>
+    <w:p>
+      <w:pPr>
+        <w:rPr>
+          <w:rFonts w:ascii="Times New Roman" w:hAnsi="Times New Roman" w:cs="Times New Roman"/>
+        </w:rPr>
+      </w:pPr>
+    </w:p>
+    <w:p>
+      <w:pPr>
+        <w:rPr>
+          <w:rFonts w:ascii="Times New Roman" w:hAnsi="Times New Roman" w:cs="Times New Roman"/>
+        </w:rPr>
+      </w:pPr>
+    </w:p>
+    <w:p>
+      <w:pPr>
+        <w:rPr>
+          <w:rFonts w:ascii="Times New Roman" w:hAnsi="Times New Roman" w:cs="Times New Roman"/>
+        </w:rPr>
+      </w:pPr>
+      <w:r>
+        <w:rPr>
+          <w:rFonts w:ascii="Times New Roman" w:hAnsi="Times New Roman" w:cs="Times New Roman"/>
+          <w:noProof/>
+        </w:rPr>
+        <w:drawing>
+          <wp:inline distT="0" distB="0" distL="0" distR="0" wp14:anchorId="347303FA" wp14:editId="7544D621">
+            <wp:extent cx="5943600" cy="3560445"/>
+            <wp:effectExtent l="0" t="0" r="0" b="0"/>
+            <wp:docPr id="1110888857" name="Picture 11"/>
+            <wp:cNvGraphicFramePr>
+              <a:graphicFrameLocks xmlns:a="http://schemas.openxmlformats.org/drawingml/2006/main" noChangeAspect="1"/>
+            </wp:cNvGraphicFramePr>
+            <a:graphic xmlns:a="http://schemas.openxmlformats.org/drawingml/2006/main">
+              <a:graphicData uri="http://schemas.openxmlformats.org/drawingml/2006/picture">
+                <pic:pic xmlns:pic="http://schemas.openxmlformats.org/drawingml/2006/picture">
+                  <pic:nvPicPr>
+                    <pic:cNvPr id="1110888857" name="Picture 1110888857"/>
+                    <pic:cNvPicPr/>
+                  </pic:nvPicPr>
+                  <pic:blipFill>
+                    <a:blip r:embed="rId23">
+                      <a:extLst>
+                        <a:ext uri="{28A0092B-C50C-407E-A947-70E740481C1C}">
+                          <a14:useLocalDpi xmlns:a14="http://schemas.microsoft.com/office/drawing/2010/main" val="0"/>
+                        </a:ext>
+                      </a:extLst>
+                    </a:blip>
+                    <a:stretch>
+                      <a:fillRect/>
+                    </a:stretch>
+                  </pic:blipFill>
+                  <pic:spPr>
+                    <a:xfrm>
+                      <a:off x="0" y="0"/>
+                      <a:ext cx="5943600" cy="3560445"/>
+                    </a:xfrm>
+                    <a:prstGeom prst="rect">
+                      <a:avLst/>
+                    </a:prstGeom>
+                  </pic:spPr>
+                </pic:pic>
+              </a:graphicData>
+            </a:graphic>
+          </wp:inline>
+        </w:drawing>
+      </w:r>
+    </w:p>
+    <w:p>
+      <w:pPr>
+        <w:rPr>
+          <w:rFonts w:ascii="Times New Roman" w:hAnsi="Times New Roman" w:cs="Times New Roman"/>
+        </w:rPr>
+      </w:pPr>
+      <w:r>
+        <w:rPr>
+          <w:rFonts w:ascii="Times New Roman" w:hAnsi="Times New Roman" w:cs="Times New Roman"/>
+        </w:rPr>
+        <w:t xml:space="preserve">ALEXANDER: CO2 follows the methane trend. Reconstruction makes the country less green. </w:t>
+      </w:r>
+    </w:p>
+    <w:p>
+      <w:pPr>
+        <w:rPr>
+          <w:rFonts w:ascii="Times New Roman" w:hAnsi="Times New Roman" w:cs="Times New Roman"/>
+        </w:rPr>
+      </w:pPr>
+    </w:p>
+    <w:p>
+      <w:pPr>
+        <w:rPr>
+          <w:rFonts w:ascii="Times New Roman" w:hAnsi="Times New Roman" w:cs="Times New Roman"/>
+        </w:rPr>
+      </w:pPr>
+      <w:r>
+        <w:rPr>
+          <w:rFonts w:ascii="Times New Roman" w:hAnsi="Times New Roman" w:cs="Times New Roman"/>
+          <w:noProof/>
+        </w:rPr>
+        <w:lastRenderedPageBreak/>
+        <w:drawing>
+          <wp:inline distT="0" distB="0" distL="0" distR="0" wp14:anchorId="0F116D1E" wp14:editId="677800FA">
+            <wp:extent cx="5943600" cy="7201535"/>
+            <wp:effectExtent l="0" t="0" r="0" b="0"/>
+            <wp:docPr id="424954268" name="Picture 12" descr="A graph of a graph of a graph&#10;&#10;Description automatically generated with medium confidence"/>
+            <wp:cNvGraphicFramePr>
+              <a:graphicFrameLocks xmlns:a="http://schemas.openxmlformats.org/drawingml/2006/main" noChangeAspect="1"/>
+            </wp:cNvGraphicFramePr>
+            <a:graphic xmlns:a="http://schemas.openxmlformats.org/drawingml/2006/main">
+              <a:graphicData uri="http://schemas.openxmlformats.org/drawingml/2006/picture">
+                <pic:pic xmlns:pic="http://schemas.openxmlformats.org/drawingml/2006/picture">
+                  <pic:nvPicPr>
+                    <pic:cNvPr id="424954268" name="Picture 12" descr="A graph of a graph of a graph&#10;&#10;Description automatically generated with medium confidence"/>
+                    <pic:cNvPicPr/>
+                  </pic:nvPicPr>
+                  <pic:blipFill>
+                    <a:blip r:embed="rId24">
+                      <a:extLst>
+                        <a:ext uri="{28A0092B-C50C-407E-A947-70E740481C1C}">
+                          <a14:useLocalDpi xmlns:a14="http://schemas.microsoft.com/office/drawing/2010/main" val="0"/>
+                        </a:ext>
+                      </a:extLst>
+                    </a:blip>
+                    <a:stretch>
+                      <a:fillRect/>
+                    </a:stretch>
+                  </pic:blipFill>
+                  <pic:spPr>
+                    <a:xfrm>
+                      <a:off x="0" y="0"/>
+                      <a:ext cx="5943600" cy="7201535"/>
+                    </a:xfrm>
+                    <a:prstGeom prst="rect">
+                      <a:avLst/>
+                    </a:prstGeom>
+                  </pic:spPr>
+                </pic:pic>
+              </a:graphicData>
+            </a:graphic>
+          </wp:inline>
+        </w:drawing>
+      </w:r>
+    </w:p>
+    <w:p>
+      <w:pPr>
+        <w:rPr>
+          <w:rFonts w:ascii="Times New Roman" w:hAnsi="Times New Roman" w:cs="Times New Roman"/>
+        </w:rPr>
+      </w:pPr>
+    </w:p>
+    <w:p>
+      <w:pPr>
+        <w:rPr>
+          <w:rFonts w:ascii="Times New Roman" w:hAnsi="Times New Roman" w:cs="Times New Roman"/>
+        </w:rPr>
+      </w:pPr>
+      <w:r>
+        <w:rPr>
+          <w:rFonts w:ascii="Times New Roman" w:hAnsi="Times New Roman" w:cs="Times New Roman"/>
+        </w:rPr>
+        <w:t xml:space="preserve">ALEXANDER: Fugitive emissions up, industry down. </w:t>
+      </w:r>
+    </w:p>
+    <w:p>
+      <w:pPr>
+        <w:rPr>
+          <w:rFonts w:ascii="Times New Roman" w:hAnsi="Times New Roman" w:cs="Times New Roman"/>
+        </w:rPr>
+      </w:pPr>
+    </w:p>
+    <w:p>
+      <w:pPr>
+        <w:rPr>
+          <w:rFonts w:ascii="Times New Roman" w:hAnsi="Times New Roman" w:cs="Times New Roman"/>
+        </w:rPr>
+      </w:pPr>
+      <w:r>
+        <w:rPr>
+          <w:rFonts w:ascii="Times New Roman" w:hAnsi="Times New Roman" w:cs="Times New Roman"/>
+          <w:noProof/>
+        </w:rPr>
+        <w:lastRenderedPageBreak/>
+        <w:drawing>
+          <wp:inline distT="0" distB="0" distL="0" distR="0" wp14:anchorId="2093B0A8" wp14:editId="6DD7365D">
+            <wp:extent cx="5943600" cy="7197090"/>
+            <wp:effectExtent l="0" t="0" r="0" b="3810"/>
+            <wp:docPr id="398787070" name="Picture 13" descr="A graph of carbon dioxide&#10;&#10;Description automatically generated"/>
+            <wp:cNvGraphicFramePr>
+              <a:graphicFrameLocks xmlns:a="http://schemas.openxmlformats.org/drawingml/2006/main" noChangeAspect="1"/>
+            </wp:cNvGraphicFramePr>
+            <a:graphic xmlns:a="http://schemas.openxmlformats.org/drawingml/2006/main">
+              <a:graphicData uri="http://schemas.openxmlformats.org/drawingml/2006/picture">
+                <pic:pic xmlns:pic="http://schemas.openxmlformats.org/drawingml/2006/picture">
+                  <pic:nvPicPr>
+                    <pic:cNvPr id="398787070" name="Picture 13" descr="A graph of carbon dioxide&#10;&#10;Description automatically generated"/>
+                    <pic:cNvPicPr/>
+                  </pic:nvPicPr>
+                  <pic:blipFill>
+                    <a:blip r:embed="rId25">
+                      <a:extLst>
+                        <a:ext uri="{28A0092B-C50C-407E-A947-70E740481C1C}">
+                          <a14:useLocalDpi xmlns:a14="http://schemas.microsoft.com/office/drawing/2010/main" val="0"/>
+                        </a:ext>
+                      </a:extLst>
+                    </a:blip>
+                    <a:stretch>
+                      <a:fillRect/>
+                    </a:stretch>
+                  </pic:blipFill>
+                  <pic:spPr>
+                    <a:xfrm>
+                      <a:off x="0" y="0"/>
+                      <a:ext cx="5943600" cy="7197090"/>
+                    </a:xfrm>
+                    <a:prstGeom prst="rect">
+                      <a:avLst/>
+                    </a:prstGeom>
+                  </pic:spPr>
+                </pic:pic>
+              </a:graphicData>
+            </a:graphic>
+          </wp:inline>
+        </w:drawing>
+      </w:r>
+    </w:p>
+    <w:p>
+      <w:pPr>
+        <w:rPr>
+          <w:rFonts w:ascii="Times New Roman" w:hAnsi="Times New Roman" w:cs="Times New Roman"/>
+        </w:rPr>
+      </w:pPr>
+      <w:r>
+        <w:rPr>
+          <w:rFonts w:ascii="Times New Roman" w:hAnsi="Times New Roman" w:cs="Times New Roman"/>
+        </w:rPr>
+        <w:t xml:space="preserve">ALEXANDER: CO2 up after Maria, hasn’t come back down. </w:t>
+      </w:r>
+    </w:p>
+    <w:p>
+      <w:pPr>
+        <w:rPr>
+          <w:rFonts w:ascii="Times New Roman" w:hAnsi="Times New Roman" w:cs="Times New Roman"/>
+        </w:rPr>
+      </w:pPr>
+    </w:p>
+    <w:p>
+      <w:pPr>
+        <w:rPr>
+          <w:rFonts w:ascii="Times New Roman" w:hAnsi="Times New Roman" w:cs="Times New Roman"/>
+        </w:rPr>
+      </w:pPr>
+    </w:p>
+    <w:p>
+      <w:pPr>
+        <w:rPr>
+          <w:rFonts w:ascii="Times New Roman" w:hAnsi="Times New Roman" w:cs="Times New Roman"/>
+        </w:rPr>
+      </w:pPr>
+    </w:p>
+    <w:p>
+      <w:pPr>
+        <w:rPr>
+          <w:rFonts w:ascii="Times New Roman" w:hAnsi="Times New Roman" w:cs="Times New Roman"/>
+        </w:rPr>
+      </w:pPr>
+    </w:p>
+    <w:p>
+      <w:pPr>
+        <w:rPr>
+          <w:rFonts w:ascii="Times New Roman" w:hAnsi="Times New Roman" w:cs="Times New Roman"/>
+        </w:rPr>
+      </w:pPr>
+      <w:r>
+        <w:rPr>
+          <w:rFonts w:ascii="Times New Roman" w:hAnsi="Times New Roman" w:cs="Times New Roman"/>
+          <w:noProof/>
+        </w:rPr>
+        <w:lastRenderedPageBreak/>
+        <w:drawing>
+          <wp:inline distT="0" distB="0" distL="0" distR="0" wp14:anchorId="41DEEFAD" wp14:editId="58A55775">
+            <wp:extent cx="5943600" cy="3601085"/>
+            <wp:effectExtent l="0" t="0" r="0" b="5715"/>
+            <wp:docPr id="2098107673" name="Picture 14" descr="A graph with a line and a blue line&#10;&#10;Description automatically generated"/>
+            <wp:cNvGraphicFramePr>
+              <a:graphicFrameLocks xmlns:a="http://schemas.openxmlformats.org/drawingml/2006/main" noChangeAspect="1"/>
+            </wp:cNvGraphicFramePr>
+            <a:graphic xmlns:a="http://schemas.openxmlformats.org/drawingml/2006/main">
+              <a:graphicData uri="http://schemas.openxmlformats.org/drawingml/2006/picture">
+                <pic:pic xmlns:pic="http://schemas.openxmlformats.org/drawingml/2006/picture">
+                  <pic:nvPicPr>
+                    <pic:cNvPr id="2098107673" name="Picture 14" descr="A graph with a line and a blue line&#10;&#10;Description automatically generated"/>
+                    <pic:cNvPicPr/>
+                  </pic:nvPicPr>
+                  <pic:blipFill>
+                    <a:blip r:embed="rId26">
+                      <a:extLst>
+                        <a:ext uri="{28A0092B-C50C-407E-A947-70E740481C1C}">
+                          <a14:useLocalDpi xmlns:a14="http://schemas.microsoft.com/office/drawing/2010/main" val="0"/>
+                        </a:ext>
+                      </a:extLst>
+                    </a:blip>
+                    <a:stretch>
+                      <a:fillRect/>
+                    </a:stretch>
+                  </pic:blipFill>
+                  <pic:spPr>
+                    <a:xfrm>
+                      <a:off x="0" y="0"/>
+                      <a:ext cx="5943600" cy="3601085"/>
+                    </a:xfrm>
+                    <a:prstGeom prst="rect">
+                      <a:avLst/>
+                    </a:prstGeom>
+                  </pic:spPr>
+                </pic:pic>
+              </a:graphicData>
+            </a:graphic>
+          </wp:inline>
+        </w:drawing>
+      </w:r>
+    </w:p>
+    <w:p>
+      <w:pPr>
+        <w:rPr>
+          <w:rFonts w:ascii="Times New Roman" w:hAnsi="Times New Roman" w:cs="Times New Roman"/>
+        </w:rPr>
+      </w:pPr>
+      <w:r>
+        <w:rPr>
+          <w:rFonts w:ascii="Times New Roman" w:hAnsi="Times New Roman" w:cs="Times New Roman"/>
+        </w:rPr>
+        <w:t xml:space="preserve">ALEXANDER: Yep, power industry is less green now. </w:t>
+      </w:r>
     </w:p>
     <w:sectPr>
       <w:pgSz w:w="12240" w:h="15840"/>
@@ -1589,6 +2786,95 @@
       </w:rPr>
     </w:lvl>
   </w:abstractNum>
+  <w:abstractNum w:abstractNumId="3" w15:restartNumberingAfterBreak="0">
+    <w:nsid w:val="5FF760F2"/>
+    <w:multiLevelType w:val="hybridMultilevel"/>
+    <w:tmpl w:val="69CE8012"/>
+    <w:lvl w:ilvl="0" w:tplc="0409000F">
+      <w:start w:val="1"/>
+      <w:numFmt w:val="decimal"/>
+      <w:lvlText w:val="%1."/>
+      <w:lvlJc w:val="left"/>
+      <w:pPr>
+        <w:ind w:left="720" w:hanging="360"/>
+      </w:pPr>
+      <w:rPr>
+        <w:rFonts w:hint="default"/>
+      </w:rPr>
+    </w:lvl>
+    <w:lvl w:ilvl="1" w:tplc="04090019" w:tentative="1">
+      <w:start w:val="1"/>
+      <w:numFmt w:val="lowerLetter"/>
+      <w:lvlText w:val="%2."/>
+      <w:lvlJc w:val="left"/>
+      <w:pPr>
+        <w:ind w:left="1440" w:hanging="360"/>
+      </w:pPr>
+    </w:lvl>
+    <w:lvl w:ilvl="2" w:tplc="0409001B" w:tentative="1">
+      <w:start w:val="1"/>
+      <w:numFmt w:val="lowerRoman"/>
+      <w:lvlText w:val="%3."/>
+      <w:lvlJc w:val="right"/>
+      <w:pPr>
+        <w:ind w:left="2160" w:hanging="180"/>
+      </w:pPr>
+    </w:lvl>
+    <w:lvl w:ilvl="3" w:tplc="0409000F" w:tentative="1">
+      <w:start w:val="1"/>
+      <w:numFmt w:val="decimal"/>
+      <w:lvlText w:val="%4."/>
+      <w:lvlJc w:val="left"/>
+      <w:pPr>
+        <w:ind w:left="2880" w:hanging="360"/>
+      </w:pPr>
+    </w:lvl>
+    <w:lvl w:ilvl="4" w:tplc="04090019" w:tentative="1">
+      <w:start w:val="1"/>
+      <w:numFmt w:val="lowerLetter"/>
+      <w:lvlText w:val="%5."/>
+      <w:lvlJc w:val="left"/>
+      <w:pPr>
+        <w:ind w:left="3600" w:hanging="360"/>
+      </w:pPr>
+    </w:lvl>
+    <w:lvl w:ilvl="5" w:tplc="0409001B" w:tentative="1">
+      <w:start w:val="1"/>
+      <w:numFmt w:val="lowerRoman"/>
+      <w:lvlText w:val="%6."/>
+      <w:lvlJc w:val="right"/>
+      <w:pPr>
+        <w:ind w:left="4320" w:hanging="180"/>
+      </w:pPr>
+    </w:lvl>
+    <w:lvl w:ilvl="6" w:tplc="0409000F" w:tentative="1">
+      <w:start w:val="1"/>
+      <w:numFmt w:val="decimal"/>
+      <w:lvlText w:val="%7."/>
+      <w:lvlJc w:val="left"/>
+      <w:pPr>
+        <w:ind w:left="5040" w:hanging="360"/>
+      </w:pPr>
+    </w:lvl>
+    <w:lvl w:ilvl="7" w:tplc="04090019" w:tentative="1">
+      <w:start w:val="1"/>
+      <w:numFmt w:val="lowerLetter"/>
+      <w:lvlText w:val="%8."/>
+      <w:lvlJc w:val="left"/>
+      <w:pPr>
+        <w:ind w:left="5760" w:hanging="360"/>
+      </w:pPr>
+    </w:lvl>
+    <w:lvl w:ilvl="8" w:tplc="0409001B" w:tentative="1">
+      <w:start w:val="1"/>
+      <w:numFmt w:val="lowerRoman"/>
+      <w:lvlText w:val="%9."/>
+      <w:lvlJc w:val="right"/>
+      <w:pPr>
+        <w:ind w:left="6480" w:hanging="180"/>
+      </w:pPr>
+    </w:lvl>
+  </w:abstractNum>
   <w:num w:numId="1" w16cid:durableId="1361710094">
     <w:abstractNumId w:val="1"/>
   </w:num>
@@ -1597,6 +2883,9 @@
   </w:num>
   <w:num w:numId="3" w16cid:durableId="1092313703">
     <w:abstractNumId w:val="2"/>
+  </w:num>
+  <w:num w:numId="4" w16cid:durableId="231505759">
+    <w:abstractNumId w:val="3"/>
   </w:num>
 </w:numbering>
 </file>
@@ -2198,6 +3487,7 @@
   <w:style w:type="character" w:default="1" w:styleId="DefaultParagraphFont">
     <w:name w:val="Default Paragraph Font"/>
     <w:uiPriority w:val="1"/>
+    <w:semiHidden/>
     <w:unhideWhenUsed/>
   </w:style>
   <w:style w:type="table" w:default="1" w:styleId="TableNormal">

</xml_diff>

<commit_message>
PRI analysis update again
</commit_message>
<xml_diff>
--- a/research_insights/PRI.docx
+++ b/research_insights/PRI.docx
@@ -486,6 +486,26 @@
         </w:rPr>
         <w:t xml:space="preserve">** If you see very long horizontal lines, the data may be trash. Our transform step caused that. Check the ‘extracted’ CSV to confirm. Some long lines are the product of forward-filling NULL values. </w:t>
       </w:r>
+      <w:r>
+        <w:rPr>
+          <w:rFonts w:ascii="Times New Roman" w:hAnsi="Times New Roman" w:cs="Times New Roman"/>
+        </w:rPr>
+        <w:t xml:space="preserve">For PRI, it seems like post-2020 data </w:t>
+      </w:r>
+      <w:proofErr w:type="spellStart"/>
+      <w:r>
+        <w:rPr>
+          <w:rFonts w:ascii="Times New Roman" w:hAnsi="Times New Roman" w:cs="Times New Roman"/>
+        </w:rPr>
+        <w:t>is</w:t>
+      </w:r>
+      <w:proofErr w:type="spellEnd"/>
+      <w:r>
+        <w:rPr>
+          <w:rFonts w:ascii="Times New Roman" w:hAnsi="Times New Roman" w:cs="Times New Roman"/>
+        </w:rPr>
+        <w:t xml:space="preserve"> spotty. I’d trash any plot with more than like, 3 missing years post-2020. We can talk about the challenges of collecting data. </w:t>
+      </w:r>
     </w:p>
     <w:p>
       <w:pPr>
@@ -512,125 +532,6 @@
     </w:p>
     <w:p>
       <w:pPr>
-        <w:rPr>
-          <w:rFonts w:ascii="Times New Roman" w:hAnsi="Times New Roman" w:cs="Times New Roman"/>
-        </w:rPr>
-      </w:pPr>
-    </w:p>
-    <w:p>
-      <w:pPr>
-        <w:rPr>
-          <w:rFonts w:ascii="Times New Roman" w:hAnsi="Times New Roman" w:cs="Times New Roman"/>
-        </w:rPr>
-      </w:pPr>
-    </w:p>
-    <w:p>
-      <w:pPr>
-        <w:rPr>
-          <w:rFonts w:ascii="Times New Roman" w:hAnsi="Times New Roman" w:cs="Times New Roman"/>
-        </w:rPr>
-      </w:pPr>
-    </w:p>
-    <w:p>
-      <w:pPr>
-        <w:rPr>
-          <w:rFonts w:ascii="Times New Roman" w:hAnsi="Times New Roman" w:cs="Times New Roman"/>
-        </w:rPr>
-      </w:pPr>
-    </w:p>
-    <w:p>
-      <w:pPr>
-        <w:rPr>
-          <w:rFonts w:ascii="Times New Roman" w:hAnsi="Times New Roman" w:cs="Times New Roman"/>
-        </w:rPr>
-      </w:pPr>
-    </w:p>
-    <w:p>
-      <w:pPr>
-        <w:rPr>
-          <w:rFonts w:ascii="Times New Roman" w:hAnsi="Times New Roman" w:cs="Times New Roman"/>
-        </w:rPr>
-      </w:pPr>
-    </w:p>
-    <w:p>
-      <w:pPr>
-        <w:rPr>
-          <w:rFonts w:ascii="Times New Roman" w:hAnsi="Times New Roman" w:cs="Times New Roman"/>
-        </w:rPr>
-      </w:pPr>
-    </w:p>
-    <w:p>
-      <w:pPr>
-        <w:rPr>
-          <w:rFonts w:ascii="Times New Roman" w:hAnsi="Times New Roman" w:cs="Times New Roman"/>
-        </w:rPr>
-      </w:pPr>
-    </w:p>
-    <w:p>
-      <w:pPr>
-        <w:rPr>
-          <w:rFonts w:ascii="Times New Roman" w:hAnsi="Times New Roman" w:cs="Times New Roman"/>
-        </w:rPr>
-      </w:pPr>
-    </w:p>
-    <w:p>
-      <w:pPr>
-        <w:rPr>
-          <w:rFonts w:ascii="Times New Roman" w:hAnsi="Times New Roman" w:cs="Times New Roman"/>
-        </w:rPr>
-      </w:pPr>
-    </w:p>
-    <w:p>
-      <w:pPr>
-        <w:rPr>
-          <w:rFonts w:ascii="Times New Roman" w:hAnsi="Times New Roman" w:cs="Times New Roman"/>
-        </w:rPr>
-      </w:pPr>
-    </w:p>
-    <w:p>
-      <w:pPr>
-        <w:rPr>
-          <w:rFonts w:ascii="Times New Roman" w:hAnsi="Times New Roman" w:cs="Times New Roman"/>
-        </w:rPr>
-      </w:pPr>
-    </w:p>
-    <w:p>
-      <w:pPr>
-        <w:rPr>
-          <w:rFonts w:ascii="Times New Roman" w:hAnsi="Times New Roman" w:cs="Times New Roman"/>
-        </w:rPr>
-      </w:pPr>
-    </w:p>
-    <w:p>
-      <w:pPr>
-        <w:rPr>
-          <w:rFonts w:ascii="Times New Roman" w:hAnsi="Times New Roman" w:cs="Times New Roman"/>
-        </w:rPr>
-      </w:pPr>
-    </w:p>
-    <w:p>
-      <w:pPr>
-        <w:rPr>
-          <w:rFonts w:ascii="Times New Roman" w:hAnsi="Times New Roman" w:cs="Times New Roman"/>
-        </w:rPr>
-      </w:pPr>
-    </w:p>
-    <w:p>
-      <w:pPr>
-        <w:rPr>
-          <w:rFonts w:ascii="Times New Roman" w:hAnsi="Times New Roman" w:cs="Times New Roman"/>
-        </w:rPr>
-      </w:pPr>
-    </w:p>
-    <w:p>
-      <w:pPr>
-        <w:rPr>
-          <w:rFonts w:ascii="Times New Roman" w:hAnsi="Times New Roman" w:cs="Times New Roman"/>
-        </w:rPr>
-      </w:pPr>
-    </w:p>
-    <w:p>
-      <w:pPr>
         <w:jc w:val="both"/>
         <w:rPr>
           <w:rFonts w:ascii="Times New Roman" w:hAnsi="Times New Roman" w:cs="Times New Roman"/>
@@ -641,6 +542,7 @@
           <w:rFonts w:ascii="Times New Roman" w:hAnsi="Times New Roman" w:cs="Times New Roman"/>
           <w:highlight w:val="yellow"/>
         </w:rPr>
+        <w:lastRenderedPageBreak/>
         <w:t>PRI: Arable land (hectares per person) and PRI: Arable land (hectares)</w:t>
       </w:r>
       <w:r>
@@ -695,7 +597,6 @@
           <w:rFonts w:ascii="Times New Roman" w:hAnsi="Times New Roman" w:cs="Times New Roman"/>
           <w:noProof/>
         </w:rPr>
-        <w:lastRenderedPageBreak/>
         <w:drawing>
           <wp:inline distT="0" distB="0" distL="0" distR="0" wp14:anchorId="6A009C7F" wp14:editId="7B60A5ED">
             <wp:extent cx="5570376" cy="6798715"/>
@@ -766,6 +667,7 @@
           <w:rFonts w:ascii="Times New Roman" w:hAnsi="Times New Roman" w:cs="Times New Roman"/>
           <w:highlight w:val="yellow"/>
         </w:rPr>
+        <w:lastRenderedPageBreak/>
         <w:t>PRI: Food production index (2014-2016 = 100)  and  PRI: Livestock production index (2014-2016 = 100).</w:t>
       </w:r>
       <w:r>
@@ -793,7 +695,6 @@
           <w:rFonts w:ascii="Times New Roman" w:hAnsi="Times New Roman" w:cs="Times New Roman"/>
           <w:noProof/>
         </w:rPr>
-        <w:lastRenderedPageBreak/>
         <w:drawing>
           <wp:inline distT="0" distB="0" distL="0" distR="0" wp14:anchorId="47107C4F" wp14:editId="04A1C919">
             <wp:extent cx="5943600" cy="7249160"/>
@@ -883,7 +784,6 @@
           <w:rFonts w:ascii="Times New Roman" w:hAnsi="Times New Roman" w:cs="Times New Roman"/>
           <w:highlight w:val="yellow"/>
         </w:rPr>
-        <w:lastRenderedPageBreak/>
         <w:t>PRI: Control of Corruption: Estimate</w:t>
       </w:r>
       <w:r>
@@ -1058,41 +958,6 @@
       <w:pPr>
         <w:rPr>
           <w:rFonts w:ascii="Times New Roman" w:hAnsi="Times New Roman" w:cs="Times New Roman"/>
-        </w:rPr>
-      </w:pPr>
-    </w:p>
-    <w:p>
-      <w:pPr>
-        <w:rPr>
-          <w:rFonts w:ascii="Times New Roman" w:hAnsi="Times New Roman" w:cs="Times New Roman"/>
-        </w:rPr>
-      </w:pPr>
-    </w:p>
-    <w:p>
-      <w:pPr>
-        <w:rPr>
-          <w:rFonts w:ascii="Times New Roman" w:hAnsi="Times New Roman" w:cs="Times New Roman"/>
-        </w:rPr>
-      </w:pPr>
-    </w:p>
-    <w:p>
-      <w:pPr>
-        <w:rPr>
-          <w:rFonts w:ascii="Times New Roman" w:hAnsi="Times New Roman" w:cs="Times New Roman"/>
-        </w:rPr>
-      </w:pPr>
-    </w:p>
-    <w:p>
-      <w:pPr>
-        <w:rPr>
-          <w:rFonts w:ascii="Times New Roman" w:hAnsi="Times New Roman" w:cs="Times New Roman"/>
-        </w:rPr>
-      </w:pPr>
-    </w:p>
-    <w:p>
-      <w:pPr>
-        <w:rPr>
-          <w:rFonts w:ascii="Times New Roman" w:hAnsi="Times New Roman" w:cs="Times New Roman"/>
           <w:sz w:val="20"/>
           <w:szCs w:val="20"/>
         </w:rPr>
@@ -1401,235 +1266,6 @@
     </w:p>
     <w:p>
       <w:pPr>
-        <w:pStyle w:val="p2"/>
-      </w:pPr>
-    </w:p>
-    <w:p>
-      <w:pPr>
-        <w:rPr>
-          <w:rFonts w:ascii="Times New Roman" w:hAnsi="Times New Roman" w:cs="Times New Roman"/>
-        </w:rPr>
-      </w:pPr>
-      <w:r>
-        <w:rPr>
-          <w:rFonts w:ascii="Times New Roman" w:hAnsi="Times New Roman" w:cs="Times New Roman"/>
-          <w:highlight w:val="yellow"/>
-        </w:rPr>
-        <w:lastRenderedPageBreak/>
-        <w:t>PRI: PM2.5 air pollution, mean annual exposure (micrograms per cubic meter)</w:t>
-      </w:r>
-      <w:r>
-        <w:rPr>
-          <w:rFonts w:ascii="Times New Roman" w:hAnsi="Times New Roman" w:cs="Times New Roman"/>
-        </w:rPr>
-        <w:t xml:space="preserve">. Could suggest that the electric grid, at the household and commonwealth level, did rely on fossil fuels for a second. </w:t>
-      </w:r>
-    </w:p>
-    <w:p>
-      <w:pPr>
-        <w:rPr>
-          <w:rFonts w:ascii="Times New Roman" w:hAnsi="Times New Roman" w:cs="Times New Roman"/>
-        </w:rPr>
-      </w:pPr>
-    </w:p>
-    <w:p>
-      <w:pPr>
-        <w:rPr>
-          <w:rFonts w:ascii="Times New Roman" w:hAnsi="Times New Roman" w:cs="Times New Roman"/>
-        </w:rPr>
-      </w:pPr>
-      <w:r>
-        <w:rPr>
-          <w:rFonts w:ascii="Times New Roman" w:hAnsi="Times New Roman" w:cs="Times New Roman"/>
-        </w:rPr>
-        <w:t xml:space="preserve">It could also be related to reconstruction emissions. But it did normalize after a while, which complicates our ability to make easy conclusions based on the previous metric. </w:t>
-      </w:r>
-    </w:p>
-    <w:p>
-      <w:pPr>
-        <w:pStyle w:val="ListParagraph"/>
-        <w:rPr>
-          <w:rFonts w:ascii="Times New Roman" w:hAnsi="Times New Roman" w:cs="Times New Roman"/>
-        </w:rPr>
-      </w:pPr>
-    </w:p>
-    <w:p>
-      <w:pPr>
-        <w:rPr>
-          <w:rFonts w:ascii="Times New Roman" w:hAnsi="Times New Roman" w:cs="Times New Roman"/>
-        </w:rPr>
-      </w:pPr>
-    </w:p>
-    <w:p>
-      <w:pPr>
-        <w:rPr>
-          <w:rFonts w:ascii="Times New Roman" w:hAnsi="Times New Roman" w:cs="Times New Roman"/>
-        </w:rPr>
-      </w:pPr>
-    </w:p>
-    <w:p>
-      <w:pPr>
-        <w:rPr>
-          <w:rFonts w:ascii="Times New Roman" w:hAnsi="Times New Roman" w:cs="Times New Roman"/>
-        </w:rPr>
-      </w:pPr>
-      <w:r>
-        <w:rPr>
-          <w:rFonts w:ascii="Times New Roman" w:hAnsi="Times New Roman" w:cs="Times New Roman"/>
-          <w:noProof/>
-        </w:rPr>
-        <w:drawing>
-          <wp:inline distT="0" distB="0" distL="0" distR="0" wp14:anchorId="5A326EC9" wp14:editId="30A60927">
-            <wp:extent cx="5943600" cy="3577590"/>
-            <wp:effectExtent l="0" t="0" r="0" b="3810"/>
-            <wp:docPr id="1990210211" name="Picture 26" descr="A graph with blue lines and numbers&#10;&#10;Description automatically generated"/>
-            <wp:cNvGraphicFramePr>
-              <a:graphicFrameLocks xmlns:a="http://schemas.openxmlformats.org/drawingml/2006/main" noChangeAspect="1"/>
-            </wp:cNvGraphicFramePr>
-            <a:graphic xmlns:a="http://schemas.openxmlformats.org/drawingml/2006/main">
-              <a:graphicData uri="http://schemas.openxmlformats.org/drawingml/2006/picture">
-                <pic:pic xmlns:pic="http://schemas.openxmlformats.org/drawingml/2006/picture">
-                  <pic:nvPicPr>
-                    <pic:cNvPr id="1990210211" name="Picture 26" descr="A graph with blue lines and numbers&#10;&#10;Description automatically generated"/>
-                    <pic:cNvPicPr/>
-                  </pic:nvPicPr>
-                  <pic:blipFill>
-                    <a:blip r:embed="rId9">
-                      <a:extLst>
-                        <a:ext uri="{28A0092B-C50C-407E-A947-70E740481C1C}">
-                          <a14:useLocalDpi xmlns:a14="http://schemas.microsoft.com/office/drawing/2010/main" val="0"/>
-                        </a:ext>
-                      </a:extLst>
-                    </a:blip>
-                    <a:stretch>
-                      <a:fillRect/>
-                    </a:stretch>
-                  </pic:blipFill>
-                  <pic:spPr>
-                    <a:xfrm>
-                      <a:off x="0" y="0"/>
-                      <a:ext cx="5943600" cy="3577590"/>
-                    </a:xfrm>
-                    <a:prstGeom prst="rect">
-                      <a:avLst/>
-                    </a:prstGeom>
-                  </pic:spPr>
-                </pic:pic>
-              </a:graphicData>
-            </a:graphic>
-          </wp:inline>
-        </w:drawing>
-      </w:r>
-    </w:p>
-    <w:p>
-      <w:pPr>
-        <w:rPr>
-          <w:rFonts w:ascii="Times New Roman" w:hAnsi="Times New Roman" w:cs="Times New Roman"/>
-        </w:rPr>
-      </w:pPr>
-    </w:p>
-    <w:p>
-      <w:pPr>
-        <w:rPr>
-          <w:rFonts w:ascii="Times New Roman" w:hAnsi="Times New Roman" w:cs="Times New Roman"/>
-        </w:rPr>
-      </w:pPr>
-    </w:p>
-    <w:p>
-      <w:pPr>
-        <w:rPr>
-          <w:rFonts w:ascii="Times New Roman" w:hAnsi="Times New Roman" w:cs="Times New Roman"/>
-        </w:rPr>
-      </w:pPr>
-    </w:p>
-    <w:p>
-      <w:pPr>
-        <w:rPr>
-          <w:rFonts w:ascii="Times New Roman" w:hAnsi="Times New Roman" w:cs="Times New Roman"/>
-        </w:rPr>
-      </w:pPr>
-    </w:p>
-    <w:p>
-      <w:pPr>
-        <w:rPr>
-          <w:rFonts w:ascii="Times New Roman" w:hAnsi="Times New Roman" w:cs="Times New Roman"/>
-        </w:rPr>
-      </w:pPr>
-    </w:p>
-    <w:p>
-      <w:pPr>
-        <w:rPr>
-          <w:rFonts w:ascii="Times New Roman" w:hAnsi="Times New Roman" w:cs="Times New Roman"/>
-        </w:rPr>
-      </w:pPr>
-    </w:p>
-    <w:p>
-      <w:pPr>
-        <w:rPr>
-          <w:rFonts w:ascii="Times New Roman" w:hAnsi="Times New Roman" w:cs="Times New Roman"/>
-          <w:i/>
-          <w:iCs/>
-        </w:rPr>
-      </w:pPr>
-    </w:p>
-    <w:p>
-      <w:pPr>
-        <w:rPr>
-          <w:rFonts w:ascii="Times New Roman" w:hAnsi="Times New Roman" w:cs="Times New Roman"/>
-          <w:color w:val="000000" w:themeColor="text1"/>
-        </w:rPr>
-      </w:pPr>
-    </w:p>
-    <w:p>
-      <w:pPr>
-        <w:rPr>
-          <w:rFonts w:ascii="Times New Roman" w:hAnsi="Times New Roman" w:cs="Times New Roman"/>
-          <w:color w:val="000000" w:themeColor="text1"/>
-        </w:rPr>
-      </w:pPr>
-    </w:p>
-    <w:p>
-      <w:pPr>
-        <w:rPr>
-          <w:rFonts w:ascii="Times New Roman" w:hAnsi="Times New Roman" w:cs="Times New Roman"/>
-          <w:color w:val="000000" w:themeColor="text1"/>
-        </w:rPr>
-      </w:pPr>
-    </w:p>
-    <w:p>
-      <w:pPr>
-        <w:rPr>
-          <w:rFonts w:ascii="Times New Roman" w:hAnsi="Times New Roman" w:cs="Times New Roman"/>
-          <w:color w:val="000000" w:themeColor="text1"/>
-        </w:rPr>
-      </w:pPr>
-    </w:p>
-    <w:p>
-      <w:pPr>
-        <w:rPr>
-          <w:rFonts w:ascii="Times New Roman" w:hAnsi="Times New Roman" w:cs="Times New Roman"/>
-          <w:color w:val="000000" w:themeColor="text1"/>
-        </w:rPr>
-      </w:pPr>
-    </w:p>
-    <w:p>
-      <w:pPr>
-        <w:rPr>
-          <w:rFonts w:ascii="Times New Roman" w:hAnsi="Times New Roman" w:cs="Times New Roman"/>
-          <w:color w:val="000000" w:themeColor="text1"/>
-        </w:rPr>
-      </w:pPr>
-    </w:p>
-    <w:p>
-      <w:pPr>
-        <w:rPr>
-          <w:rFonts w:ascii="Times New Roman" w:hAnsi="Times New Roman" w:cs="Times New Roman"/>
-          <w:color w:val="000000" w:themeColor="text1"/>
-        </w:rPr>
-      </w:pPr>
-    </w:p>
-    <w:p>
-      <w:pPr>
         <w:rPr>
           <w:rFonts w:ascii="Times New Roman" w:hAnsi="Times New Roman" w:cs="Times New Roman"/>
           <w:color w:val="000000" w:themeColor="text1"/>
@@ -1714,7 +1350,7 @@
                     <pic:cNvPicPr/>
                   </pic:nvPicPr>
                   <pic:blipFill>
-                    <a:blip r:embed="rId10">
+                    <a:blip r:embed="rId9">
                       <a:extLst>
                         <a:ext uri="{28A0092B-C50C-407E-A947-70E740481C1C}">
                           <a14:useLocalDpi xmlns:a14="http://schemas.microsoft.com/office/drawing/2010/main" val="0"/>
@@ -2043,7 +1679,7 @@
                     <pic:cNvPicPr/>
                   </pic:nvPicPr>
                   <pic:blipFill>
-                    <a:blip r:embed="rId11">
+                    <a:blip r:embed="rId10">
                       <a:extLst>
                         <a:ext uri="{28A0092B-C50C-407E-A947-70E740481C1C}">
                           <a14:useLocalDpi xmlns:a14="http://schemas.microsoft.com/office/drawing/2010/main" val="0"/>
@@ -2350,7 +1986,7 @@
                     <pic:cNvPicPr/>
                   </pic:nvPicPr>
                   <pic:blipFill>
-                    <a:blip r:embed="rId12">
+                    <a:blip r:embed="rId11">
                       <a:extLst>
                         <a:ext uri="{28A0092B-C50C-407E-A947-70E740481C1C}">
                           <a14:useLocalDpi xmlns:a14="http://schemas.microsoft.com/office/drawing/2010/main" val="0"/>
@@ -2896,7 +2532,7 @@
                     <pic:cNvPicPr/>
                   </pic:nvPicPr>
                   <pic:blipFill>
-                    <a:blip r:embed="rId13">
+                    <a:blip r:embed="rId12">
                       <a:extLst>
                         <a:ext uri="{28A0092B-C50C-407E-A947-70E740481C1C}">
                           <a14:useLocalDpi xmlns:a14="http://schemas.microsoft.com/office/drawing/2010/main" val="0"/>
@@ -3204,7 +2840,7 @@
                     <pic:cNvPicPr/>
                   </pic:nvPicPr>
                   <pic:blipFill>
-                    <a:blip r:embed="rId14">
+                    <a:blip r:embed="rId13">
                       <a:extLst>
                         <a:ext uri="{28A0092B-C50C-407E-A947-70E740481C1C}">
                           <a14:useLocalDpi xmlns:a14="http://schemas.microsoft.com/office/drawing/2010/main" val="0"/>
@@ -3416,6 +3052,244 @@
                 <pic:pic xmlns:pic="http://schemas.openxmlformats.org/drawingml/2006/picture">
                   <pic:nvPicPr>
                     <pic:cNvPr id="1646931499" name="Picture 34" descr="A graph with a line going up&#10;&#10;Description automatically generated"/>
+                    <pic:cNvPicPr/>
+                  </pic:nvPicPr>
+                  <pic:blipFill>
+                    <a:blip r:embed="rId14">
+                      <a:extLst>
+                        <a:ext uri="{28A0092B-C50C-407E-A947-70E740481C1C}">
+                          <a14:useLocalDpi xmlns:a14="http://schemas.microsoft.com/office/drawing/2010/main" val="0"/>
+                        </a:ext>
+                      </a:extLst>
+                    </a:blip>
+                    <a:stretch>
+                      <a:fillRect/>
+                    </a:stretch>
+                  </pic:blipFill>
+                  <pic:spPr>
+                    <a:xfrm>
+                      <a:off x="0" y="0"/>
+                      <a:ext cx="5943600" cy="3573780"/>
+                    </a:xfrm>
+                    <a:prstGeom prst="rect">
+                      <a:avLst/>
+                    </a:prstGeom>
+                  </pic:spPr>
+                </pic:pic>
+              </a:graphicData>
+            </a:graphic>
+          </wp:inline>
+        </w:drawing>
+      </w:r>
+    </w:p>
+    <w:p>
+      <w:pPr>
+        <w:rPr>
+          <w:rFonts w:ascii="Times New Roman" w:hAnsi="Times New Roman" w:cs="Times New Roman"/>
+        </w:rPr>
+      </w:pPr>
+    </w:p>
+    <w:p>
+      <w:pPr>
+        <w:rPr>
+          <w:rFonts w:ascii="Times New Roman" w:hAnsi="Times New Roman" w:cs="Times New Roman"/>
+        </w:rPr>
+      </w:pPr>
+    </w:p>
+    <w:p>
+      <w:pPr>
+        <w:rPr>
+          <w:rFonts w:ascii="Times New Roman" w:hAnsi="Times New Roman" w:cs="Times New Roman"/>
+        </w:rPr>
+      </w:pPr>
+    </w:p>
+    <w:p>
+      <w:pPr>
+        <w:rPr>
+          <w:rFonts w:ascii="Times New Roman" w:hAnsi="Times New Roman" w:cs="Times New Roman"/>
+        </w:rPr>
+      </w:pPr>
+    </w:p>
+    <w:p>
+      <w:pPr>
+        <w:rPr>
+          <w:rFonts w:ascii="Times New Roman" w:hAnsi="Times New Roman" w:cs="Times New Roman"/>
+        </w:rPr>
+      </w:pPr>
+    </w:p>
+    <w:p>
+      <w:pPr>
+        <w:rPr>
+          <w:rFonts w:ascii="Times New Roman" w:hAnsi="Times New Roman" w:cs="Times New Roman"/>
+        </w:rPr>
+      </w:pPr>
+    </w:p>
+    <w:p>
+      <w:pPr>
+        <w:rPr>
+          <w:rFonts w:ascii="Times New Roman" w:hAnsi="Times New Roman" w:cs="Times New Roman"/>
+        </w:rPr>
+      </w:pPr>
+    </w:p>
+    <w:p>
+      <w:pPr>
+        <w:rPr>
+          <w:rFonts w:ascii="Times New Roman" w:hAnsi="Times New Roman" w:cs="Times New Roman"/>
+        </w:rPr>
+      </w:pPr>
+    </w:p>
+    <w:p>
+      <w:pPr>
+        <w:rPr>
+          <w:rFonts w:ascii="Times New Roman" w:hAnsi="Times New Roman" w:cs="Times New Roman"/>
+        </w:rPr>
+      </w:pPr>
+    </w:p>
+    <w:p>
+      <w:pPr>
+        <w:rPr>
+          <w:rFonts w:ascii="Times New Roman" w:hAnsi="Times New Roman" w:cs="Times New Roman"/>
+        </w:rPr>
+      </w:pPr>
+    </w:p>
+    <w:p>
+      <w:pPr>
+        <w:rPr>
+          <w:rFonts w:ascii="Times New Roman" w:hAnsi="Times New Roman" w:cs="Times New Roman"/>
+        </w:rPr>
+      </w:pPr>
+    </w:p>
+    <w:p>
+      <w:pPr>
+        <w:rPr>
+          <w:rFonts w:ascii="Times New Roman" w:hAnsi="Times New Roman" w:cs="Times New Roman"/>
+        </w:rPr>
+      </w:pPr>
+    </w:p>
+    <w:p>
+      <w:pPr>
+        <w:rPr>
+          <w:rFonts w:ascii="Times New Roman" w:hAnsi="Times New Roman" w:cs="Times New Roman"/>
+        </w:rPr>
+      </w:pPr>
+    </w:p>
+    <w:p>
+      <w:pPr>
+        <w:rPr>
+          <w:rFonts w:ascii="Times New Roman" w:hAnsi="Times New Roman" w:cs="Times New Roman"/>
+        </w:rPr>
+      </w:pPr>
+    </w:p>
+    <w:p>
+      <w:pPr>
+        <w:rPr>
+          <w:rFonts w:ascii="Times New Roman" w:hAnsi="Times New Roman" w:cs="Times New Roman"/>
+        </w:rPr>
+      </w:pPr>
+    </w:p>
+    <w:p>
+      <w:pPr>
+        <w:rPr>
+          <w:rFonts w:ascii="Times New Roman" w:hAnsi="Times New Roman" w:cs="Times New Roman"/>
+        </w:rPr>
+      </w:pPr>
+    </w:p>
+    <w:p>
+      <w:pPr>
+        <w:rPr>
+          <w:rFonts w:ascii="Times New Roman" w:hAnsi="Times New Roman" w:cs="Times New Roman"/>
+        </w:rPr>
+      </w:pPr>
+    </w:p>
+    <w:p>
+      <w:pPr>
+        <w:rPr>
+          <w:rFonts w:ascii="Times New Roman" w:hAnsi="Times New Roman" w:cs="Times New Roman"/>
+        </w:rPr>
+      </w:pPr>
+    </w:p>
+    <w:p>
+      <w:pPr>
+        <w:rPr>
+          <w:rFonts w:ascii="Times New Roman" w:hAnsi="Times New Roman" w:cs="Times New Roman"/>
+        </w:rPr>
+      </w:pPr>
+    </w:p>
+    <w:p>
+      <w:pPr>
+        <w:rPr>
+          <w:rFonts w:ascii="Times New Roman" w:hAnsi="Times New Roman" w:cs="Times New Roman"/>
+        </w:rPr>
+      </w:pPr>
+    </w:p>
+    <w:p>
+      <w:pPr>
+        <w:rPr>
+          <w:rFonts w:ascii="Times New Roman" w:hAnsi="Times New Roman" w:cs="Times New Roman"/>
+        </w:rPr>
+      </w:pPr>
+      <w:r>
+        <w:rPr>
+          <w:rFonts w:ascii="Times New Roman" w:hAnsi="Times New Roman" w:cs="Times New Roman"/>
+          <w:highlight w:val="yellow"/>
+        </w:rPr>
+        <w:lastRenderedPageBreak/>
+        <w:t>PRI: Methane (CH4) emissions from Power Industry (Energy) (Mt CO2e)</w:t>
+      </w:r>
+      <w:r>
+        <w:rPr>
+          <w:rFonts w:ascii="Times New Roman" w:hAnsi="Times New Roman" w:cs="Times New Roman"/>
+        </w:rPr>
+        <w:t xml:space="preserve">. Yeah. </w:t>
+      </w:r>
+      <w:r>
+        <w:rPr>
+          <w:rFonts w:ascii="Times New Roman" w:hAnsi="Times New Roman" w:cs="Times New Roman"/>
+          <w:b/>
+          <w:bCs/>
+        </w:rPr>
+        <w:t xml:space="preserve">It really does seem like the grid is to blame. </w:t>
+      </w:r>
+      <w:r>
+        <w:rPr>
+          <w:rFonts w:ascii="Times New Roman" w:hAnsi="Times New Roman" w:cs="Times New Roman"/>
+        </w:rPr>
+        <w:t xml:space="preserve">It’s less efficient and less green in aggregate now. </w:t>
+      </w:r>
+    </w:p>
+    <w:p>
+      <w:pPr>
+        <w:rPr>
+          <w:rFonts w:ascii="Times New Roman" w:hAnsi="Times New Roman" w:cs="Times New Roman"/>
+        </w:rPr>
+      </w:pPr>
+    </w:p>
+    <w:p>
+      <w:pPr>
+        <w:rPr>
+          <w:rFonts w:ascii="Times New Roman" w:hAnsi="Times New Roman" w:cs="Times New Roman"/>
+          <w:color w:val="FF0000"/>
+        </w:rPr>
+      </w:pPr>
+      <w:r>
+        <w:rPr>
+          <w:rFonts w:ascii="Times New Roman" w:hAnsi="Times New Roman" w:cs="Times New Roman"/>
+          <w:noProof/>
+          <w:color w:val="FF0000"/>
+        </w:rPr>
+        <w:drawing>
+          <wp:inline distT="0" distB="0" distL="0" distR="0" wp14:anchorId="1D37731C" wp14:editId="0EF0FFDC">
+            <wp:extent cx="5943600" cy="3573780"/>
+            <wp:effectExtent l="0" t="0" r="0" b="0"/>
+            <wp:docPr id="434949382" name="Picture 35" descr="A graph with a line going up&#10;&#10;Description automatically generated"/>
+            <wp:cNvGraphicFramePr>
+              <a:graphicFrameLocks xmlns:a="http://schemas.openxmlformats.org/drawingml/2006/main" noChangeAspect="1"/>
+            </wp:cNvGraphicFramePr>
+            <a:graphic xmlns:a="http://schemas.openxmlformats.org/drawingml/2006/main">
+              <a:graphicData uri="http://schemas.openxmlformats.org/drawingml/2006/picture">
+                <pic:pic xmlns:pic="http://schemas.openxmlformats.org/drawingml/2006/picture">
+                  <pic:nvPicPr>
+                    <pic:cNvPr id="434949382" name="Picture 35" descr="A graph with a line going up&#10;&#10;Description automatically generated"/>
                     <pic:cNvPicPr/>
                   </pic:nvPicPr>
                   <pic:blipFill>
@@ -3450,244 +3324,6 @@
       <w:pPr>
         <w:rPr>
           <w:rFonts w:ascii="Times New Roman" w:hAnsi="Times New Roman" w:cs="Times New Roman"/>
-        </w:rPr>
-      </w:pPr>
-    </w:p>
-    <w:p>
-      <w:pPr>
-        <w:rPr>
-          <w:rFonts w:ascii="Times New Roman" w:hAnsi="Times New Roman" w:cs="Times New Roman"/>
-        </w:rPr>
-      </w:pPr>
-    </w:p>
-    <w:p>
-      <w:pPr>
-        <w:rPr>
-          <w:rFonts w:ascii="Times New Roman" w:hAnsi="Times New Roman" w:cs="Times New Roman"/>
-        </w:rPr>
-      </w:pPr>
-    </w:p>
-    <w:p>
-      <w:pPr>
-        <w:rPr>
-          <w:rFonts w:ascii="Times New Roman" w:hAnsi="Times New Roman" w:cs="Times New Roman"/>
-        </w:rPr>
-      </w:pPr>
-    </w:p>
-    <w:p>
-      <w:pPr>
-        <w:rPr>
-          <w:rFonts w:ascii="Times New Roman" w:hAnsi="Times New Roman" w:cs="Times New Roman"/>
-        </w:rPr>
-      </w:pPr>
-    </w:p>
-    <w:p>
-      <w:pPr>
-        <w:rPr>
-          <w:rFonts w:ascii="Times New Roman" w:hAnsi="Times New Roman" w:cs="Times New Roman"/>
-        </w:rPr>
-      </w:pPr>
-    </w:p>
-    <w:p>
-      <w:pPr>
-        <w:rPr>
-          <w:rFonts w:ascii="Times New Roman" w:hAnsi="Times New Roman" w:cs="Times New Roman"/>
-        </w:rPr>
-      </w:pPr>
-    </w:p>
-    <w:p>
-      <w:pPr>
-        <w:rPr>
-          <w:rFonts w:ascii="Times New Roman" w:hAnsi="Times New Roman" w:cs="Times New Roman"/>
-        </w:rPr>
-      </w:pPr>
-    </w:p>
-    <w:p>
-      <w:pPr>
-        <w:rPr>
-          <w:rFonts w:ascii="Times New Roman" w:hAnsi="Times New Roman" w:cs="Times New Roman"/>
-        </w:rPr>
-      </w:pPr>
-    </w:p>
-    <w:p>
-      <w:pPr>
-        <w:rPr>
-          <w:rFonts w:ascii="Times New Roman" w:hAnsi="Times New Roman" w:cs="Times New Roman"/>
-        </w:rPr>
-      </w:pPr>
-    </w:p>
-    <w:p>
-      <w:pPr>
-        <w:rPr>
-          <w:rFonts w:ascii="Times New Roman" w:hAnsi="Times New Roman" w:cs="Times New Roman"/>
-        </w:rPr>
-      </w:pPr>
-    </w:p>
-    <w:p>
-      <w:pPr>
-        <w:rPr>
-          <w:rFonts w:ascii="Times New Roman" w:hAnsi="Times New Roman" w:cs="Times New Roman"/>
-        </w:rPr>
-      </w:pPr>
-    </w:p>
-    <w:p>
-      <w:pPr>
-        <w:rPr>
-          <w:rFonts w:ascii="Times New Roman" w:hAnsi="Times New Roman" w:cs="Times New Roman"/>
-        </w:rPr>
-      </w:pPr>
-    </w:p>
-    <w:p>
-      <w:pPr>
-        <w:rPr>
-          <w:rFonts w:ascii="Times New Roman" w:hAnsi="Times New Roman" w:cs="Times New Roman"/>
-        </w:rPr>
-      </w:pPr>
-    </w:p>
-    <w:p>
-      <w:pPr>
-        <w:rPr>
-          <w:rFonts w:ascii="Times New Roman" w:hAnsi="Times New Roman" w:cs="Times New Roman"/>
-        </w:rPr>
-      </w:pPr>
-    </w:p>
-    <w:p>
-      <w:pPr>
-        <w:rPr>
-          <w:rFonts w:ascii="Times New Roman" w:hAnsi="Times New Roman" w:cs="Times New Roman"/>
-        </w:rPr>
-      </w:pPr>
-    </w:p>
-    <w:p>
-      <w:pPr>
-        <w:rPr>
-          <w:rFonts w:ascii="Times New Roman" w:hAnsi="Times New Roman" w:cs="Times New Roman"/>
-        </w:rPr>
-      </w:pPr>
-    </w:p>
-    <w:p>
-      <w:pPr>
-        <w:rPr>
-          <w:rFonts w:ascii="Times New Roman" w:hAnsi="Times New Roman" w:cs="Times New Roman"/>
-        </w:rPr>
-      </w:pPr>
-    </w:p>
-    <w:p>
-      <w:pPr>
-        <w:rPr>
-          <w:rFonts w:ascii="Times New Roman" w:hAnsi="Times New Roman" w:cs="Times New Roman"/>
-        </w:rPr>
-      </w:pPr>
-    </w:p>
-    <w:p>
-      <w:pPr>
-        <w:rPr>
-          <w:rFonts w:ascii="Times New Roman" w:hAnsi="Times New Roman" w:cs="Times New Roman"/>
-        </w:rPr>
-      </w:pPr>
-    </w:p>
-    <w:p>
-      <w:pPr>
-        <w:rPr>
-          <w:rFonts w:ascii="Times New Roman" w:hAnsi="Times New Roman" w:cs="Times New Roman"/>
-        </w:rPr>
-      </w:pPr>
-      <w:r>
-        <w:rPr>
-          <w:rFonts w:ascii="Times New Roman" w:hAnsi="Times New Roman" w:cs="Times New Roman"/>
-          <w:highlight w:val="yellow"/>
-        </w:rPr>
-        <w:lastRenderedPageBreak/>
-        <w:t>PRI: Methane (CH4) emissions from Power Industry (Energy) (Mt CO2e)</w:t>
-      </w:r>
-      <w:r>
-        <w:rPr>
-          <w:rFonts w:ascii="Times New Roman" w:hAnsi="Times New Roman" w:cs="Times New Roman"/>
-        </w:rPr>
-        <w:t xml:space="preserve">. Yeah. </w:t>
-      </w:r>
-      <w:r>
-        <w:rPr>
-          <w:rFonts w:ascii="Times New Roman" w:hAnsi="Times New Roman" w:cs="Times New Roman"/>
-          <w:b/>
-          <w:bCs/>
-        </w:rPr>
-        <w:t xml:space="preserve">It really does seem like the grid is to blame. </w:t>
-      </w:r>
-      <w:r>
-        <w:rPr>
-          <w:rFonts w:ascii="Times New Roman" w:hAnsi="Times New Roman" w:cs="Times New Roman"/>
-        </w:rPr>
-        <w:t xml:space="preserve">It’s less efficient and less green in aggregate now. </w:t>
-      </w:r>
-    </w:p>
-    <w:p>
-      <w:pPr>
-        <w:rPr>
-          <w:rFonts w:ascii="Times New Roman" w:hAnsi="Times New Roman" w:cs="Times New Roman"/>
-        </w:rPr>
-      </w:pPr>
-    </w:p>
-    <w:p>
-      <w:pPr>
-        <w:rPr>
-          <w:rFonts w:ascii="Times New Roman" w:hAnsi="Times New Roman" w:cs="Times New Roman"/>
-          <w:color w:val="FF0000"/>
-        </w:rPr>
-      </w:pPr>
-      <w:r>
-        <w:rPr>
-          <w:rFonts w:ascii="Times New Roman" w:hAnsi="Times New Roman" w:cs="Times New Roman"/>
-          <w:noProof/>
-          <w:color w:val="FF0000"/>
-        </w:rPr>
-        <w:drawing>
-          <wp:inline distT="0" distB="0" distL="0" distR="0" wp14:anchorId="1D37731C" wp14:editId="0EF0FFDC">
-            <wp:extent cx="5943600" cy="3573780"/>
-            <wp:effectExtent l="0" t="0" r="0" b="0"/>
-            <wp:docPr id="434949382" name="Picture 35" descr="A graph with a line going up&#10;&#10;Description automatically generated"/>
-            <wp:cNvGraphicFramePr>
-              <a:graphicFrameLocks xmlns:a="http://schemas.openxmlformats.org/drawingml/2006/main" noChangeAspect="1"/>
-            </wp:cNvGraphicFramePr>
-            <a:graphic xmlns:a="http://schemas.openxmlformats.org/drawingml/2006/main">
-              <a:graphicData uri="http://schemas.openxmlformats.org/drawingml/2006/picture">
-                <pic:pic xmlns:pic="http://schemas.openxmlformats.org/drawingml/2006/picture">
-                  <pic:nvPicPr>
-                    <pic:cNvPr id="434949382" name="Picture 35" descr="A graph with a line going up&#10;&#10;Description automatically generated"/>
-                    <pic:cNvPicPr/>
-                  </pic:nvPicPr>
-                  <pic:blipFill>
-                    <a:blip r:embed="rId16">
-                      <a:extLst>
-                        <a:ext uri="{28A0092B-C50C-407E-A947-70E740481C1C}">
-                          <a14:useLocalDpi xmlns:a14="http://schemas.microsoft.com/office/drawing/2010/main" val="0"/>
-                        </a:ext>
-                      </a:extLst>
-                    </a:blip>
-                    <a:stretch>
-                      <a:fillRect/>
-                    </a:stretch>
-                  </pic:blipFill>
-                  <pic:spPr>
-                    <a:xfrm>
-                      <a:off x="0" y="0"/>
-                      <a:ext cx="5943600" cy="3573780"/>
-                    </a:xfrm>
-                    <a:prstGeom prst="rect">
-                      <a:avLst/>
-                    </a:prstGeom>
-                  </pic:spPr>
-                </pic:pic>
-              </a:graphicData>
-            </a:graphic>
-          </wp:inline>
-        </w:drawing>
-      </w:r>
-    </w:p>
-    <w:p>
-      <w:pPr>
-        <w:rPr>
-          <w:rFonts w:ascii="Times New Roman" w:hAnsi="Times New Roman" w:cs="Times New Roman"/>
           <w:color w:val="FF0000"/>
         </w:rPr>
       </w:pPr>
@@ -3924,7 +3560,7 @@
                     <pic:cNvPicPr/>
                   </pic:nvPicPr>
                   <pic:blipFill>
-                    <a:blip r:embed="rId17">
+                    <a:blip r:embed="rId16">
                       <a:extLst>
                         <a:ext uri="{28A0092B-C50C-407E-A947-70E740481C1C}">
                           <a14:useLocalDpi xmlns:a14="http://schemas.microsoft.com/office/drawing/2010/main" val="0"/>
@@ -4060,7 +3696,7 @@
                     <pic:cNvPicPr/>
                   </pic:nvPicPr>
                   <pic:blipFill>
-                    <a:blip r:embed="rId18">
+                    <a:blip r:embed="rId17">
                       <a:extLst>
                         <a:ext uri="{28A0092B-C50C-407E-A947-70E740481C1C}">
                           <a14:useLocalDpi xmlns:a14="http://schemas.microsoft.com/office/drawing/2010/main" val="0"/>
@@ -4147,7 +3783,7 @@
                     <pic:cNvPicPr/>
                   </pic:nvPicPr>
                   <pic:blipFill>
-                    <a:blip r:embed="rId19">
+                    <a:blip r:embed="rId18">
                       <a:extLst>
                         <a:ext uri="{28A0092B-C50C-407E-A947-70E740481C1C}">
                           <a14:useLocalDpi xmlns:a14="http://schemas.microsoft.com/office/drawing/2010/main" val="0"/>
@@ -4255,7 +3891,7 @@
                     <pic:cNvPicPr/>
                   </pic:nvPicPr>
                   <pic:blipFill>
-                    <a:blip r:embed="rId20">
+                    <a:blip r:embed="rId19">
                       <a:extLst>
                         <a:ext uri="{28A0092B-C50C-407E-A947-70E740481C1C}">
                           <a14:useLocalDpi xmlns:a14="http://schemas.microsoft.com/office/drawing/2010/main" val="0"/>
@@ -4316,7 +3952,7 @@
                     <pic:cNvPicPr/>
                   </pic:nvPicPr>
                   <pic:blipFill>
-                    <a:blip r:embed="rId21">
+                    <a:blip r:embed="rId20">
                       <a:extLst>
                         <a:ext uri="{28A0092B-C50C-407E-A947-70E740481C1C}">
                           <a14:useLocalDpi xmlns:a14="http://schemas.microsoft.com/office/drawing/2010/main" val="0"/>
@@ -4412,7 +4048,7 @@
                     <pic:cNvPicPr/>
                   </pic:nvPicPr>
                   <pic:blipFill>
-                    <a:blip r:embed="rId22">
+                    <a:blip r:embed="rId21">
                       <a:extLst>
                         <a:ext uri="{28A0092B-C50C-407E-A947-70E740481C1C}">
                           <a14:useLocalDpi xmlns:a14="http://schemas.microsoft.com/office/drawing/2010/main" val="0"/>
@@ -5067,7 +4703,7 @@
                     <pic:cNvPicPr/>
                   </pic:nvPicPr>
                   <pic:blipFill>
-                    <a:blip r:embed="rId23">
+                    <a:blip r:embed="rId22">
                       <a:extLst>
                         <a:ext uri="{28A0092B-C50C-407E-A947-70E740481C1C}">
                           <a14:useLocalDpi xmlns:a14="http://schemas.microsoft.com/office/drawing/2010/main" val="0"/>
@@ -5162,7 +4798,7 @@
                     <pic:cNvPicPr/>
                   </pic:nvPicPr>
                   <pic:blipFill>
-                    <a:blip r:embed="rId24">
+                    <a:blip r:embed="rId23">
                       <a:extLst>
                         <a:ext uri="{28A0092B-C50C-407E-A947-70E740481C1C}">
                           <a14:useLocalDpi xmlns:a14="http://schemas.microsoft.com/office/drawing/2010/main" val="0"/>
@@ -5276,7 +4912,7 @@
                     <pic:cNvPicPr/>
                   </pic:nvPicPr>
                   <pic:blipFill>
-                    <a:blip r:embed="rId25">
+                    <a:blip r:embed="rId24">
                       <a:extLst>
                         <a:ext uri="{28A0092B-C50C-407E-A947-70E740481C1C}">
                           <a14:useLocalDpi xmlns:a14="http://schemas.microsoft.com/office/drawing/2010/main" val="0"/>
@@ -5534,7 +5170,7 @@
                     <pic:cNvPicPr/>
                   </pic:nvPicPr>
                   <pic:blipFill>
-                    <a:blip r:embed="rId26">
+                    <a:blip r:embed="rId25">
                       <a:extLst>
                         <a:ext uri="{28A0092B-C50C-407E-A947-70E740481C1C}">
                           <a14:useLocalDpi xmlns:a14="http://schemas.microsoft.com/office/drawing/2010/main" val="0"/>
@@ -5581,7 +5217,7 @@
                     <pic:cNvPicPr/>
                   </pic:nvPicPr>
                   <pic:blipFill>
-                    <a:blip r:embed="rId27">
+                    <a:blip r:embed="rId26">
                       <a:extLst>
                         <a:ext uri="{28A0092B-C50C-407E-A947-70E740481C1C}">
                           <a14:useLocalDpi xmlns:a14="http://schemas.microsoft.com/office/drawing/2010/main" val="0"/>
@@ -5677,7 +5313,7 @@
                     <pic:cNvPicPr/>
                   </pic:nvPicPr>
                   <pic:blipFill>
-                    <a:blip r:embed="rId28">
+                    <a:blip r:embed="rId27">
                       <a:extLst>
                         <a:ext uri="{28A0092B-C50C-407E-A947-70E740481C1C}">
                           <a14:useLocalDpi xmlns:a14="http://schemas.microsoft.com/office/drawing/2010/main" val="0"/>
@@ -5920,7 +5556,7 @@
                     <pic:cNvPicPr/>
                   </pic:nvPicPr>
                   <pic:blipFill>
-                    <a:blip r:embed="rId29">
+                    <a:blip r:embed="rId28">
                       <a:extLst>
                         <a:ext uri="{28A0092B-C50C-407E-A947-70E740481C1C}">
                           <a14:useLocalDpi xmlns:a14="http://schemas.microsoft.com/office/drawing/2010/main" val="0"/>
@@ -6153,7 +5789,7 @@
                     <pic:cNvPicPr/>
                   </pic:nvPicPr>
                   <pic:blipFill>
-                    <a:blip r:embed="rId30">
+                    <a:blip r:embed="rId29">
                       <a:extLst>
                         <a:ext uri="{28A0092B-C50C-407E-A947-70E740481C1C}">
                           <a14:useLocalDpi xmlns:a14="http://schemas.microsoft.com/office/drawing/2010/main" val="0"/>
@@ -6403,7 +6039,7 @@
                     <pic:cNvPicPr/>
                   </pic:nvPicPr>
                   <pic:blipFill>
-                    <a:blip r:embed="rId31">
+                    <a:blip r:embed="rId30">
                       <a:extLst>
                         <a:ext uri="{28A0092B-C50C-407E-A947-70E740481C1C}">
                           <a14:useLocalDpi xmlns:a14="http://schemas.microsoft.com/office/drawing/2010/main" val="0"/>
@@ -6726,7 +6362,7 @@
                     <pic:cNvPicPr/>
                   </pic:nvPicPr>
                   <pic:blipFill>
-                    <a:blip r:embed="rId32">
+                    <a:blip r:embed="rId31">
                       <a:extLst>
                         <a:ext uri="{28A0092B-C50C-407E-A947-70E740481C1C}">
                           <a14:useLocalDpi xmlns:a14="http://schemas.microsoft.com/office/drawing/2010/main" val="0"/>
@@ -6834,7 +6470,7 @@
                     <pic:cNvPicPr/>
                   </pic:nvPicPr>
                   <pic:blipFill>
-                    <a:blip r:embed="rId33">
+                    <a:blip r:embed="rId32">
                       <a:extLst>
                         <a:ext uri="{28A0092B-C50C-407E-A947-70E740481C1C}">
                           <a14:useLocalDpi xmlns:a14="http://schemas.microsoft.com/office/drawing/2010/main" val="0"/>

</xml_diff>

<commit_message>
PRI Analysis: eliminated bad plots from doc
</commit_message>
<xml_diff>
--- a/research_insights/PRI.docx
+++ b/research_insights/PRI.docx
@@ -490,21 +490,7 @@
         <w:rPr>
           <w:rFonts w:ascii="Times New Roman" w:hAnsi="Times New Roman" w:cs="Times New Roman"/>
         </w:rPr>
-        <w:t xml:space="preserve">For PRI, it seems like post-2020 data </w:t>
-      </w:r>
-      <w:proofErr w:type="spellStart"/>
-      <w:r>
-        <w:rPr>
-          <w:rFonts w:ascii="Times New Roman" w:hAnsi="Times New Roman" w:cs="Times New Roman"/>
-        </w:rPr>
-        <w:t>is</w:t>
-      </w:r>
-      <w:proofErr w:type="spellEnd"/>
-      <w:r>
-        <w:rPr>
-          <w:rFonts w:ascii="Times New Roman" w:hAnsi="Times New Roman" w:cs="Times New Roman"/>
-        </w:rPr>
-        <w:t xml:space="preserve"> spotty. I’d trash any plot with more than like, 3 missing years post-2020. We can talk about the challenges of collecting data. </w:t>
+        <w:t xml:space="preserve">For PRI, it seems like post-2020 data is spotty. </w:t>
       </w:r>
     </w:p>
     <w:p>
@@ -4240,35 +4226,7 @@
         <w:rPr>
           <w:rFonts w:ascii="Times New Roman" w:hAnsi="Times New Roman" w:cs="Times New Roman"/>
         </w:rPr>
-        <w:t xml:space="preserve">. The metric “Carbon intensity of GDP (kg </w:t>
-      </w:r>
-      <w:proofErr w:type="spellStart"/>
-      <w:r>
-        <w:rPr>
-          <w:rFonts w:ascii="Times New Roman" w:hAnsi="Times New Roman" w:cs="Times New Roman"/>
-        </w:rPr>
-        <w:t>CO₂e</w:t>
-      </w:r>
-      <w:proofErr w:type="spellEnd"/>
-      <w:r>
-        <w:rPr>
-          <w:rFonts w:ascii="Times New Roman" w:hAnsi="Times New Roman" w:cs="Times New Roman"/>
-        </w:rPr>
-        <w:t xml:space="preserve"> per constant 2015 US$ of GDP)” measures the amount of carbon dioxide equivalent (</w:t>
-      </w:r>
-      <w:proofErr w:type="spellStart"/>
-      <w:r>
-        <w:rPr>
-          <w:rFonts w:ascii="Times New Roman" w:hAnsi="Times New Roman" w:cs="Times New Roman"/>
-        </w:rPr>
-        <w:t>CO₂e</w:t>
-      </w:r>
-      <w:proofErr w:type="spellEnd"/>
-      <w:r>
-        <w:rPr>
-          <w:rFonts w:ascii="Times New Roman" w:hAnsi="Times New Roman" w:cs="Times New Roman"/>
-        </w:rPr>
-        <w:t>) emissions generated for each unit of economic output, expressed in constant 2015 US dollars. It reflects the relationship between a country’s economic productivity and its greenhouse gas emissions.</w:t>
+        <w:t>. The metric “Carbon intensity of GDP (kg CO₂e per constant 2015 US$ of GDP)” measures the amount of carbon dioxide equivalent (CO₂e) emissions generated for each unit of economic output, expressed in constant 2015 US dollars. It reflects the relationship between a country’s economic productivity and its greenhouse gas emissions.</w:t>
       </w:r>
     </w:p>
     <w:p>
@@ -5505,21 +5463,7 @@
         <w:rPr>
           <w:rFonts w:ascii="Times New Roman" w:hAnsi="Times New Roman" w:cs="Times New Roman"/>
         </w:rPr>
-        <w:t xml:space="preserve">. </w:t>
-      </w:r>
-      <w:proofErr w:type="gramStart"/>
-      <w:r>
-        <w:rPr>
-          <w:rFonts w:ascii="Times New Roman" w:hAnsi="Times New Roman" w:cs="Times New Roman"/>
-        </w:rPr>
-        <w:t>Well</w:t>
-      </w:r>
-      <w:proofErr w:type="gramEnd"/>
-      <w:r>
-        <w:rPr>
-          <w:rFonts w:ascii="Times New Roman" w:hAnsi="Times New Roman" w:cs="Times New Roman"/>
-        </w:rPr>
-        <w:t xml:space="preserve"> N20 from the grid has been coming down for a while in Puerto Rico, and it was doing the same for C02, but it then spiked over there after Maria and hasn’t come down. Maybe my worse fuels/poor efficiency hypothesis is right? </w:t>
+        <w:t xml:space="preserve">. Well N20 from the grid has been coming down for a while in Puerto Rico, and it was doing the same for C02, but it then spiked over there after Maria and hasn’t come down. Maybe my worse fuels/poor efficiency hypothesis is right? </w:t>
       </w:r>
     </w:p>
     <w:p>
@@ -5751,15 +5695,7 @@
         <w:t>PRI: Nitrous oxide (N2O) emissions from Transport (Energy) (Mt CO2e)</w:t>
       </w:r>
       <w:r>
-        <w:t xml:space="preserve">. It definitely seems to be the grid, it hasn’t </w:t>
-      </w:r>
-      <w:proofErr w:type="gramStart"/>
-      <w:r>
-        <w:t>have</w:t>
-      </w:r>
-      <w:proofErr w:type="gramEnd"/>
-      <w:r>
-        <w:t xml:space="preserve"> to do with say, Transport. </w:t>
+        <w:t xml:space="preserve">. It definitely seems to be the grid, it hasn’t have to do with say, Transport. </w:t>
       </w:r>
     </w:p>
     <w:p>

</xml_diff>